<commit_message>
YZU-layout file: keep figure, caption and note together; add the PDF render
The figure description could land on the next page away from its figure; now
kept together. PDF rendered from the Word file (82 pages, Liberation Serif
stands in for Times New Roman). Log row added.

Co-Authored-By: Claude Sonnet 5.5 <noreply@anthropic.com>
Claude-Session: https://claude.ai/code/session_01XxH9J9TaLYfAYFCaGAqS9y
</commit_message>
<xml_diff>
--- a/papers/thesis_2026-10/reading/thesis_YZU_layout_2026-10-24.docx
+++ b/papers/thesis_2026-10/reading/thesis_YZU_layout_2026-10-24.docx
@@ -400,901 +400,901 @@
         <w:tab/>
       </w:r>
       <w:r>
+        <w:t xml:space="preserve">11</w:t>
+      </w:r>
+    </w:p>
+    <w:p>
+      <w:pPr>
+        <w:pStyle w:val="toc2"/>
+      </w:pPr>
+      <w:r>
+        <w:t xml:space="preserve">3.2 Three measures</w:t>
+      </w:r>
+      <w:r>
+        <w:tab/>
+      </w:r>
+      <w:r>
+        <w:t xml:space="preserve">12</w:t>
+      </w:r>
+    </w:p>
+    <w:p>
+      <w:pPr>
+        <w:pStyle w:val="toc2"/>
+      </w:pPr>
+      <w:r>
+        <w:t xml:space="preserve">3.3 Tracing a movement</w:t>
+      </w:r>
+      <w:r>
+        <w:tab/>
+      </w:r>
+      <w:r>
+        <w:t xml:space="preserve">13</w:t>
+      </w:r>
+    </w:p>
+    <w:p>
+      <w:pPr>
+        <w:pStyle w:val="toc2"/>
+      </w:pPr>
+      <w:r>
+        <w:t xml:space="preserve">3.4 Hypotheses</w:t>
+      </w:r>
+      <w:r>
+        <w:tab/>
+      </w:r>
+      <w:r>
+        <w:t xml:space="preserve">14</w:t>
+      </w:r>
+    </w:p>
+    <w:p>
+      <w:pPr>
+        <w:pStyle w:val="toc2"/>
+      </w:pPr>
+      <w:r>
+        <w:t xml:space="preserve">3.5 The entry test</w:t>
+      </w:r>
+      <w:r>
+        <w:tab/>
+      </w:r>
+      <w:r>
+        <w:t xml:space="preserve">16</w:t>
+      </w:r>
+    </w:p>
+    <w:p>
+      <w:pPr>
+        <w:pStyle w:val="toc2"/>
+      </w:pPr>
+      <w:r>
+        <w:t xml:space="preserve">3.6 Further analyses</w:t>
+      </w:r>
+      <w:r>
+        <w:tab/>
+      </w:r>
+      <w:r>
+        <w:t xml:space="preserve">17</w:t>
+      </w:r>
+    </w:p>
+    <w:p>
+      <w:pPr>
+        <w:pStyle w:val="toc1"/>
+      </w:pPr>
+      <w:r>
+        <w:t xml:space="preserve">Chapter 4 Data and Methods</w:t>
+      </w:r>
+      <w:r>
+        <w:tab/>
+      </w:r>
+      <w:r>
+        <w:t xml:space="preserve">19</w:t>
+      </w:r>
+    </w:p>
+    <w:p>
+      <w:pPr>
+        <w:pStyle w:val="toc2"/>
+      </w:pPr>
+      <w:r>
+        <w:t xml:space="preserve">4.1 The platform data</w:t>
+      </w:r>
+      <w:r>
+        <w:tab/>
+      </w:r>
+      <w:r>
+        <w:t xml:space="preserve">20</w:t>
+      </w:r>
+    </w:p>
+    <w:p>
+      <w:pPr>
+        <w:pStyle w:val="toc2"/>
+      </w:pPr>
+      <w:r>
+        <w:t xml:space="preserve">4.2 Measuring the wedge in Indonesia</w:t>
+      </w:r>
+      <w:r>
+        <w:tab/>
+      </w:r>
+      <w:r>
+        <w:t xml:space="preserve">21</w:t>
+      </w:r>
+    </w:p>
+    <w:p>
+      <w:pPr>
+        <w:pStyle w:val="toc2"/>
+      </w:pPr>
+      <w:r>
+        <w:t xml:space="preserve">4.3 Testing H1</w:t>
+      </w:r>
+      <w:r>
+        <w:tab/>
+      </w:r>
+      <w:r>
+        <w:t xml:space="preserve">22</w:t>
+      </w:r>
+    </w:p>
+    <w:p>
+      <w:pPr>
+        <w:pStyle w:val="toc2"/>
+      </w:pPr>
+      <w:r>
+        <w:t xml:space="preserve">4.4 Tracing the moves</w:t>
+      </w:r>
+      <w:r>
+        <w:tab/>
+      </w:r>
+      <w:r>
+        <w:t xml:space="preserve">22</w:t>
+      </w:r>
+    </w:p>
+    <w:p>
+      <w:pPr>
+        <w:pStyle w:val="toc2"/>
+      </w:pPr>
+      <w:r>
+        <w:t xml:space="preserve">4.5 Market values</w:t>
+      </w:r>
+      <w:r>
+        <w:tab/>
+      </w:r>
+      <w:r>
+        <w:t xml:space="preserve">23</w:t>
+      </w:r>
+    </w:p>
+    <w:p>
+      <w:pPr>
+        <w:pStyle w:val="toc2"/>
+      </w:pPr>
+      <w:r>
+        <w:t xml:space="preserve">4.6 The survey files and H2</w:t>
+      </w:r>
+      <w:r>
+        <w:tab/>
+      </w:r>
+      <w:r>
+        <w:t xml:space="preserve">24</w:t>
+      </w:r>
+    </w:p>
+    <w:p>
+      <w:pPr>
+        <w:pStyle w:val="toc2"/>
+      </w:pPr>
+      <w:r>
+        <w:t xml:space="preserve">4.7 The entry test and the extra sellers</w:t>
+      </w:r>
+      <w:r>
+        <w:tab/>
+      </w:r>
+      <w:r>
+        <w:t xml:space="preserve">24</w:t>
+      </w:r>
+    </w:p>
+    <w:p>
+      <w:pPr>
+        <w:pStyle w:val="toc2"/>
+      </w:pPr>
+      <w:r>
+        <w:t xml:space="preserve">4.8 Channels, records and reach</w:t>
+      </w:r>
+      <w:r>
+        <w:tab/>
+      </w:r>
+      <w:r>
+        <w:t xml:space="preserve">25</w:t>
+      </w:r>
+    </w:p>
+    <w:p>
+      <w:pPr>
+        <w:pStyle w:val="toc2"/>
+      </w:pPr>
+      <w:r>
+        <w:t xml:space="preserve">4.9 Comparing national figures</w:t>
+      </w:r>
+      <w:r>
+        <w:tab/>
+      </w:r>
+      <w:r>
+        <w:t xml:space="preserve">26</w:t>
+      </w:r>
+    </w:p>
+    <w:p>
+      <w:pPr>
+        <w:pStyle w:val="toc2"/>
+      </w:pPr>
+      <w:r>
+        <w:t xml:space="preserve">4.10 Labels, traceability and licensed data</w:t>
+      </w:r>
+      <w:r>
+        <w:tab/>
+      </w:r>
+      <w:r>
+        <w:t xml:space="preserve">27</w:t>
+      </w:r>
+    </w:p>
+    <w:p>
+      <w:pPr>
+        <w:pStyle w:val="toc1"/>
+      </w:pPr>
+      <w:r>
+        <w:t xml:space="preserve">Chapter 5 Results</w:t>
+      </w:r>
+      <w:r>
+        <w:tab/>
+      </w:r>
+      <w:r>
+        <w:t xml:space="preserve">28</w:t>
+      </w:r>
+    </w:p>
+    <w:p>
+      <w:pPr>
+        <w:pStyle w:val="toc2"/>
+      </w:pPr>
+      <w:r>
+        <w:t xml:space="preserve">5.1 How much revenue leaves out</w:t>
+      </w:r>
+      <w:r>
+        <w:tab/>
+      </w:r>
+      <w:r>
+        <w:t xml:space="preserve">29</w:t>
+      </w:r>
+    </w:p>
+    <w:p>
+      <w:pPr>
+        <w:pStyle w:val="toc2"/>
+      </w:pPr>
+      <w:r>
+        <w:t xml:space="preserve">5.2 Testing H1</w:t>
+      </w:r>
+      <w:r>
+        <w:tab/>
+      </w:r>
+      <w:r>
+        <w:t xml:space="preserve">30</w:t>
+      </w:r>
+    </w:p>
+    <w:p>
+      <w:pPr>
+        <w:pStyle w:val="toc2"/>
+      </w:pPr>
+      <w:r>
+        <w:t xml:space="preserve">5.3 What moved the take rate</w:t>
+      </w:r>
+      <w:r>
+        <w:tab/>
+      </w:r>
+      <w:r>
+        <w:t xml:space="preserve">32</w:t>
+      </w:r>
+    </w:p>
+    <w:p>
+      <w:pPr>
+        <w:pStyle w:val="toc2"/>
+      </w:pPr>
+      <w:r>
+        <w:t xml:space="preserve">5.4 What markets valued</w:t>
+      </w:r>
+      <w:r>
+        <w:tab/>
+      </w:r>
+      <w:r>
+        <w:t xml:space="preserve">34</w:t>
+      </w:r>
+    </w:p>
+    <w:p>
+      <w:pPr>
+        <w:pStyle w:val="toc2"/>
+      </w:pPr>
+      <w:r>
+        <w:t xml:space="preserve">5.5 The platforms and the sellers in 2023</w:t>
+      </w:r>
+      <w:r>
+        <w:tab/>
+      </w:r>
+      <w:r>
+        <w:t xml:space="preserve">35</w:t>
+      </w:r>
+    </w:p>
+    <w:p>
+      <w:pPr>
+        <w:pStyle w:val="toc2"/>
+      </w:pPr>
+      <w:r>
+        <w:t xml:space="preserve">5.6 H2 and the entry test</w:t>
+      </w:r>
+      <w:r>
+        <w:tab/>
+      </w:r>
+      <w:r>
+        <w:t xml:space="preserve">36</w:t>
+      </w:r>
+    </w:p>
+    <w:p>
+      <w:pPr>
+        <w:pStyle w:val="toc2"/>
+      </w:pPr>
+      <w:r>
+        <w:t xml:space="preserve">5.7 What the rise in the count contains</w:t>
+      </w:r>
+      <w:r>
+        <w:tab/>
+      </w:r>
+      <w:r>
+        <w:t xml:space="preserve">36</w:t>
+      </w:r>
+    </w:p>
+    <w:p>
+      <w:pPr>
+        <w:pStyle w:val="toc2"/>
+      </w:pPr>
+      <w:r>
+        <w:t xml:space="preserve">5.8 Who the extra sellers were</w:t>
+      </w:r>
+      <w:r>
+        <w:tab/>
+      </w:r>
+      <w:r>
+        <w:t xml:space="preserve">38</w:t>
+      </w:r>
+    </w:p>
+    <w:p>
+      <w:pPr>
+        <w:pStyle w:val="toc2"/>
+      </w:pPr>
+      <w:r>
+        <w:t xml:space="preserve">5.9 Channels and records</w:t>
+      </w:r>
+      <w:r>
+        <w:tab/>
+      </w:r>
+      <w:r>
+        <w:t xml:space="preserve">39</w:t>
+      </w:r>
+    </w:p>
+    <w:p>
+      <w:pPr>
+        <w:pStyle w:val="toc2"/>
+      </w:pPr>
+      <w:r>
+        <w:t xml:space="preserve">5.10 Why the national figures disagree</w:t>
+      </w:r>
+      <w:r>
+        <w:tab/>
+      </w:r>
+      <w:r>
+        <w:t xml:space="preserve">41</w:t>
+      </w:r>
+    </w:p>
+    <w:p>
+      <w:pPr>
+        <w:pStyle w:val="toc1"/>
+      </w:pPr>
+      <w:r>
+        <w:t xml:space="preserve">Chapter 6 Discussion and Policy Implications</w:t>
+      </w:r>
+      <w:r>
+        <w:tab/>
+      </w:r>
+      <w:r>
+        <w:t xml:space="preserve">43</w:t>
+      </w:r>
+    </w:p>
+    <w:p>
+      <w:pPr>
+        <w:pStyle w:val="toc2"/>
+      </w:pPr>
+      <w:r>
+        <w:t xml:space="preserve">6.1 The rules and what each acts on</w:t>
+      </w:r>
+      <w:r>
+        <w:tab/>
+      </w:r>
+      <w:r>
+        <w:t xml:space="preserve">43</w:t>
+      </w:r>
+    </w:p>
+    <w:p>
+      <w:pPr>
+        <w:pStyle w:val="toc2"/>
+      </w:pPr>
+      <w:r>
+        <w:t xml:space="preserve">6.2 What the commission cap and the discount rule can move</w:t>
+      </w:r>
+      <w:r>
+        <w:tab/>
+      </w:r>
+      <w:r>
+        <w:t xml:space="preserve">45</w:t>
+      </w:r>
+    </w:p>
+    <w:p>
+      <w:pPr>
+        <w:pStyle w:val="toc2"/>
+      </w:pPr>
+      <w:r>
+        <w:t xml:space="preserve">6.3 How far the marketplace tax reaches</w:t>
+      </w:r>
+      <w:r>
+        <w:tab/>
+      </w:r>
+      <w:r>
+        <w:t xml:space="preserve">46</w:t>
+      </w:r>
+    </w:p>
+    <w:p>
+      <w:pPr>
+        <w:pStyle w:val="toc2"/>
+      </w:pPr>
+      <w:r>
+        <w:t xml:space="preserve">6.4 What the statistics rules can change</w:t>
+      </w:r>
+      <w:r>
+        <w:tab/>
+      </w:r>
+      <w:r>
+        <w:t xml:space="preserve">48</w:t>
+      </w:r>
+    </w:p>
+    <w:p>
+      <w:pPr>
+        <w:pStyle w:val="toc2"/>
+      </w:pPr>
+      <w:r>
+        <w:t xml:space="preserve">6.5 What the registered predictions test</w:t>
+      </w:r>
+      <w:r>
+        <w:tab/>
+      </w:r>
+      <w:r>
+        <w:t xml:space="preserve">48</w:t>
+      </w:r>
+    </w:p>
+    <w:p>
+      <w:pPr>
+        <w:pStyle w:val="toc2"/>
+      </w:pPr>
+      <w:r>
+        <w:t xml:space="preserve">6.6 Beyond Indonesia</w:t>
+      </w:r>
+      <w:r>
+        <w:tab/>
+      </w:r>
+      <w:r>
+        <w:t xml:space="preserve">49</w:t>
+      </w:r>
+    </w:p>
+    <w:p>
+      <w:pPr>
+        <w:pStyle w:val="toc1"/>
+      </w:pPr>
+      <w:r>
+        <w:t xml:space="preserve">Chapter 7 Conclusion</w:t>
+      </w:r>
+      <w:r>
+        <w:tab/>
+      </w:r>
+      <w:r>
+        <w:t xml:space="preserve">51</w:t>
+      </w:r>
+    </w:p>
+    <w:p>
+      <w:pPr>
+        <w:pStyle w:val="toc2"/>
+      </w:pPr>
+      <w:r>
+        <w:t xml:space="preserve">7.1 The answer to the research question</w:t>
+      </w:r>
+      <w:r>
+        <w:tab/>
+      </w:r>
+      <w:r>
+        <w:t xml:space="preserve">51</w:t>
+      </w:r>
+    </w:p>
+    <w:p>
+      <w:pPr>
+        <w:pStyle w:val="toc2"/>
+      </w:pPr>
+      <w:r>
+        <w:t xml:space="preserve">7.2 What the thesis adds</w:t>
+      </w:r>
+      <w:r>
+        <w:tab/>
+      </w:r>
+      <w:r>
+        <w:t xml:space="preserve">52</w:t>
+      </w:r>
+    </w:p>
+    <w:p>
+      <w:pPr>
+        <w:pStyle w:val="toc2"/>
+      </w:pPr>
+      <w:r>
+        <w:t xml:space="preserve">7.3 Predictions that failed</w:t>
+      </w:r>
+      <w:r>
+        <w:tab/>
+      </w:r>
+      <w:r>
+        <w:t xml:space="preserve">53</w:t>
+      </w:r>
+    </w:p>
+    <w:p>
+      <w:pPr>
+        <w:pStyle w:val="toc2"/>
+      </w:pPr>
+      <w:r>
+        <w:t xml:space="preserve">7.4 Limits of the evidence</w:t>
+      </w:r>
+      <w:r>
+        <w:tab/>
+      </w:r>
+      <w:r>
+        <w:t xml:space="preserve">54</w:t>
+      </w:r>
+    </w:p>
+    <w:p>
+      <w:pPr>
+        <w:pStyle w:val="toc2"/>
+      </w:pPr>
+      <w:r>
+        <w:t xml:space="preserve">7.5 Further research</w:t>
+      </w:r>
+      <w:r>
+        <w:tab/>
+      </w:r>
+      <w:r>
+        <w:t xml:space="preserve">56</w:t>
+      </w:r>
+    </w:p>
+    <w:p>
+      <w:pPr>
+        <w:pStyle w:val="toc1"/>
+      </w:pPr>
+      <w:r>
+        <w:t xml:space="preserve">Appendices</w:t>
+      </w:r>
+      <w:r>
+        <w:tab/>
+      </w:r>
+      <w:r>
+        <w:t xml:space="preserve">57</w:t>
+      </w:r>
+    </w:p>
+    <w:p>
+      <w:pPr>
+        <w:pStyle w:val="toc2"/>
+      </w:pPr>
+      <w:r>
+        <w:t xml:space="preserve">Appendix A. Platforms, windows and the wedge by year</w:t>
+      </w:r>
+      <w:r>
+        <w:tab/>
+      </w:r>
+      <w:r>
+        <w:t xml:space="preserve">57</w:t>
+      </w:r>
+    </w:p>
+    <w:p>
+      <w:pPr>
+        <w:pStyle w:val="toc2"/>
+      </w:pPr>
+      <w:r>
+        <w:t xml:space="preserve">Appendix B. The checks on the test of H1</w:t>
+      </w:r>
+      <w:r>
+        <w:tab/>
+      </w:r>
+      <w:r>
+        <w:t xml:space="preserve">60</w:t>
+      </w:r>
+    </w:p>
+    <w:p>
+      <w:pPr>
+        <w:pStyle w:val="toc2"/>
+      </w:pPr>
+      <w:r>
+        <w:t xml:space="preserve">Appendix C. Registered tests and their outcomes</w:t>
+      </w:r>
+      <w:r>
+        <w:tab/>
+      </w:r>
+      <w:r>
+        <w:t xml:space="preserve">63</w:t>
+      </w:r>
+    </w:p>
+    <w:p>
+      <w:pPr>
+        <w:pStyle w:val="toc2"/>
+      </w:pPr>
+      <w:r>
+        <w:t xml:space="preserve">Appendix D. The values behind Figures 4 to 6</w:t>
+      </w:r>
+      <w:r>
+        <w:tab/>
+      </w:r>
+      <w:r>
+        <w:t xml:space="preserve">65</w:t>
+      </w:r>
+    </w:p>
+    <w:p>
+      <w:pPr>
+        <w:pStyle w:val="toc1"/>
+      </w:pPr>
+      <w:r>
+        <w:t xml:space="preserve">References</w:t>
+      </w:r>
+      <w:r>
+        <w:tab/>
+      </w:r>
+      <w:r>
+        <w:t xml:space="preserve">67</w:t>
+      </w:r>
+      <w:r>
+        <w:fldChar w:fldCharType="end"/>
+      </w:r>
+    </w:p>
+    <w:p>
+      <w:pPr>
+        <w:pStyle w:val="FrontHeading"/>
+      </w:pPr>
+      <w:r>
+        <w:t xml:space="preserve">List of Tables</w:t>
+      </w:r>
+    </w:p>
+    <w:p>
+      <w:pPr>
+        <w:pStyle w:val="tableoffigures"/>
+      </w:pPr>
+      <w:r>
+        <w:fldChar w:fldCharType="begin"/>
+      </w:r>
+      <w:r>
+        <w:instrText xml:space="preserve">TOC \t "Table Caption,1"</w:instrText>
+      </w:r>
+      <w:r>
+        <w:fldChar w:fldCharType="separate"/>
+      </w:r>
+      <w:r>
+        <w:t xml:space="preserve">Table 1. What the literature establishes and where it stops</w:t>
+      </w:r>
+      <w:r>
+        <w:tab/>
+      </w:r>
+      <w:r>
+        <w:t xml:space="preserve">8</w:t>
+      </w:r>
+    </w:p>
+    <w:p>
+      <w:pPr>
+        <w:pStyle w:val="tableoffigures"/>
+      </w:pPr>
+      <w:r>
+        <w:t xml:space="preserve">Table 2. Terms and symbols</w:t>
+      </w:r>
+      <w:r>
+        <w:tab/>
+      </w:r>
+      <w:r>
+        <w:t xml:space="preserve">11</w:t>
+      </w:r>
+    </w:p>
+    <w:p>
+      <w:pPr>
+        <w:pStyle w:val="tableoffigures"/>
+      </w:pPr>
+      <w:r>
+        <w:t xml:space="preserve">Table 3. Hypotheses, tests and what would count against them</w:t>
+      </w:r>
+      <w:r>
+        <w:tab/>
+      </w:r>
+      <w:r>
+        <w:t xml:space="preserve">14</w:t>
+      </w:r>
+    </w:p>
+    <w:p>
+      <w:pPr>
+        <w:pStyle w:val="tableoffigures"/>
+      </w:pPr>
+      <w:r>
+        <w:t xml:space="preserve">Table 4. Further analyses</w:t>
+      </w:r>
+      <w:r>
+        <w:tab/>
+      </w:r>
+      <w:r>
+        <w:t xml:space="preserve">17</w:t>
+      </w:r>
+    </w:p>
+    <w:p>
+      <w:pPr>
+        <w:pStyle w:val="tableoffigures"/>
+      </w:pPr>
+      <w:r>
+        <w:t xml:space="preserve">Table 5. The Indonesian and regional group of platforms</w:t>
+      </w:r>
+      <w:r>
+        <w:tab/>
+      </w:r>
+      <w:r>
+        <w:t xml:space="preserve">20</w:t>
+      </w:r>
+    </w:p>
+    <w:p>
+      <w:pPr>
+        <w:pStyle w:val="tableoffigures"/>
+      </w:pPr>
+      <w:r>
+        <w:t xml:space="preserve">Table 6. The three BPS survey files</w:t>
+      </w:r>
+      <w:r>
+        <w:tab/>
+      </w:r>
+      <w:r>
+        <w:t xml:space="preserve">24</w:t>
+      </w:r>
+    </w:p>
+    <w:p>
+      <w:pPr>
+        <w:pStyle w:val="tableoffigures"/>
+      </w:pPr>
+      <w:r>
+        <w:t xml:space="preserve">Table 7. Sources compared in Objective 3</w:t>
+      </w:r>
+      <w:r>
+        <w:tab/>
+      </w:r>
+      <w:r>
+        <w:t xml:space="preserve">26</w:t>
+      </w:r>
+    </w:p>
+    <w:p>
+      <w:pPr>
+        <w:pStyle w:val="tableoffigures"/>
+      </w:pPr>
+      <w:r>
+        <w:t xml:space="preserve">Table 8. Main results and the evidence behind them</w:t>
+      </w:r>
+      <w:r>
+        <w:tab/>
+      </w:r>
+      <w:r>
+        <w:t xml:space="preserve">28</w:t>
+      </w:r>
+    </w:p>
+    <w:p>
+      <w:pPr>
+        <w:pStyle w:val="tableoffigures"/>
+      </w:pPr>
+      <w:r>
+        <w:t xml:space="preserve">Table 9. The invisible wedge of three platforms, 2023 (US$ billion)</w:t>
+      </w:r>
+      <w:r>
+        <w:tab/>
+      </w:r>
+      <w:r>
+        <w:t xml:space="preserve">29</w:t>
+      </w:r>
+    </w:p>
+    <w:p>
+      <w:pPr>
+        <w:pStyle w:val="tableoffigures"/>
+      </w:pPr>
+      <w:r>
+        <w:t xml:space="preserve">Table 10. The test of H1</w:t>
+      </w:r>
+      <w:r>
+        <w:tab/>
+      </w:r>
+      <w:r>
+        <w:t xml:space="preserve">30</w:t>
+      </w:r>
+    </w:p>
+    <w:p>
+      <w:pPr>
+        <w:pStyle w:val="tableoffigures"/>
+      </w:pPr>
+      <w:r>
+        <w:t xml:space="preserve">Table 11. What moved revenue in seven Indonesian and regional windows (share of the growth of revenue, percent)</w:t>
+      </w:r>
+      <w:r>
+        <w:tab/>
+      </w:r>
+      <w:r>
+        <w:t xml:space="preserve">33</w:t>
+      </w:r>
+    </w:p>
+    <w:p>
+      <w:pPr>
+        <w:pStyle w:val="tableoffigures"/>
+      </w:pPr>
+      <w:r>
+        <w:t xml:space="preserve">Table 12. The 2023 rise in the count of online sellers (thousands)</w:t>
+      </w:r>
+      <w:r>
+        <w:tab/>
+      </w:r>
+      <w:r>
+        <w:t xml:space="preserve">36</w:t>
+      </w:r>
+    </w:p>
+    <w:p>
+      <w:pPr>
+        <w:pStyle w:val="tableoffigures"/>
+      </w:pPr>
+      <w:r>
+        <w:t xml:space="preserve">Table 13. Indonesia’s recent rules and what each acts on</w:t>
+      </w:r>
+      <w:r>
+        <w:tab/>
+      </w:r>
+      <w:r>
+        <w:t xml:space="preserve">43</w:t>
+      </w:r>
+    </w:p>
+    <w:p>
+      <w:pPr>
+        <w:pStyle w:val="tableoffigures"/>
+      </w:pPr>
+      <w:r>
+        <w:t xml:space="preserve">Table 14. Registered predictions on the 2026 rules</w:t>
+      </w:r>
+      <w:r>
+        <w:tab/>
+      </w:r>
+      <w:r>
+        <w:t xml:space="preserve">48</w:t>
+      </w:r>
+      <w:r>
+        <w:fldChar w:fldCharType="end"/>
+      </w:r>
+    </w:p>
+    <w:p>
+      <w:pPr>
+        <w:pStyle w:val="FrontHeading"/>
+      </w:pPr>
+      <w:r>
+        <w:t xml:space="preserve">List of Figures</w:t>
+      </w:r>
+    </w:p>
+    <w:p>
+      <w:pPr>
+        <w:pStyle w:val="tableoffigures"/>
+      </w:pPr>
+      <w:r>
+        <w:fldChar w:fldCharType="begin"/>
+      </w:r>
+      <w:r>
+        <w:instrText xml:space="preserve">TOC \t "Figure Caption,1"</w:instrText>
+      </w:r>
+      <w:r>
+        <w:fldChar w:fldCharType="separate"/>
+      </w:r>
+      <w:r>
+        <w:t xml:space="preserve">Figure 1. Three nested quantities and the two links.</w:t>
+      </w:r>
+      <w:r>
+        <w:tab/>
+      </w:r>
+      <w:r>
         <w:t xml:space="preserve">10</w:t>
-      </w:r>
-    </w:p>
-    <w:p>
-      <w:pPr>
-        <w:pStyle w:val="toc2"/>
-      </w:pPr>
-      <w:r>
-        <w:t xml:space="preserve">3.2 Three measures</w:t>
-      </w:r>
-      <w:r>
-        <w:tab/>
-      </w:r>
-      <w:r>
-        <w:t xml:space="preserve">11</w:t>
-      </w:r>
-    </w:p>
-    <w:p>
-      <w:pPr>
-        <w:pStyle w:val="toc2"/>
-      </w:pPr>
-      <w:r>
-        <w:t xml:space="preserve">3.3 Tracing a movement</w:t>
-      </w:r>
-      <w:r>
-        <w:tab/>
-      </w:r>
-      <w:r>
-        <w:t xml:space="preserve">13</w:t>
-      </w:r>
-    </w:p>
-    <w:p>
-      <w:pPr>
-        <w:pStyle w:val="toc2"/>
-      </w:pPr>
-      <w:r>
-        <w:t xml:space="preserve">3.4 Hypotheses</w:t>
-      </w:r>
-      <w:r>
-        <w:tab/>
-      </w:r>
-      <w:r>
-        <w:t xml:space="preserve">14</w:t>
-      </w:r>
-    </w:p>
-    <w:p>
-      <w:pPr>
-        <w:pStyle w:val="toc2"/>
-      </w:pPr>
-      <w:r>
-        <w:t xml:space="preserve">3.5 The entry test</w:t>
-      </w:r>
-      <w:r>
-        <w:tab/>
-      </w:r>
-      <w:r>
-        <w:t xml:space="preserve">16</w:t>
-      </w:r>
-    </w:p>
-    <w:p>
-      <w:pPr>
-        <w:pStyle w:val="toc2"/>
-      </w:pPr>
-      <w:r>
-        <w:t xml:space="preserve">3.6 Further analyses</w:t>
-      </w:r>
-      <w:r>
-        <w:tab/>
-      </w:r>
-      <w:r>
-        <w:t xml:space="preserve">17</w:t>
-      </w:r>
-    </w:p>
-    <w:p>
-      <w:pPr>
-        <w:pStyle w:val="toc1"/>
-      </w:pPr>
-      <w:r>
-        <w:t xml:space="preserve">Chapter 4 Data and Methods</w:t>
-      </w:r>
-      <w:r>
-        <w:tab/>
-      </w:r>
-      <w:r>
-        <w:t xml:space="preserve">19</w:t>
-      </w:r>
-    </w:p>
-    <w:p>
-      <w:pPr>
-        <w:pStyle w:val="toc2"/>
-      </w:pPr>
-      <w:r>
-        <w:t xml:space="preserve">4.1 The platform data</w:t>
-      </w:r>
-      <w:r>
-        <w:tab/>
-      </w:r>
-      <w:r>
-        <w:t xml:space="preserve">20</w:t>
-      </w:r>
-    </w:p>
-    <w:p>
-      <w:pPr>
-        <w:pStyle w:val="toc2"/>
-      </w:pPr>
-      <w:r>
-        <w:t xml:space="preserve">4.2 Measuring the wedge in Indonesia</w:t>
-      </w:r>
-      <w:r>
-        <w:tab/>
-      </w:r>
-      <w:r>
-        <w:t xml:space="preserve">21</w:t>
-      </w:r>
-    </w:p>
-    <w:p>
-      <w:pPr>
-        <w:pStyle w:val="toc2"/>
-      </w:pPr>
-      <w:r>
-        <w:t xml:space="preserve">4.3 Testing H1</w:t>
-      </w:r>
-      <w:r>
-        <w:tab/>
-      </w:r>
-      <w:r>
-        <w:t xml:space="preserve">22</w:t>
-      </w:r>
-    </w:p>
-    <w:p>
-      <w:pPr>
-        <w:pStyle w:val="toc2"/>
-      </w:pPr>
-      <w:r>
-        <w:t xml:space="preserve">4.4 Tracing the moves</w:t>
-      </w:r>
-      <w:r>
-        <w:tab/>
-      </w:r>
-      <w:r>
-        <w:t xml:space="preserve">22</w:t>
-      </w:r>
-    </w:p>
-    <w:p>
-      <w:pPr>
-        <w:pStyle w:val="toc2"/>
-      </w:pPr>
-      <w:r>
-        <w:t xml:space="preserve">4.5 Market values</w:t>
-      </w:r>
-      <w:r>
-        <w:tab/>
-      </w:r>
-      <w:r>
-        <w:t xml:space="preserve">23</w:t>
-      </w:r>
-    </w:p>
-    <w:p>
-      <w:pPr>
-        <w:pStyle w:val="toc2"/>
-      </w:pPr>
-      <w:r>
-        <w:t xml:space="preserve">4.6 The survey files and H2</w:t>
-      </w:r>
-      <w:r>
-        <w:tab/>
-      </w:r>
-      <w:r>
-        <w:t xml:space="preserve">24</w:t>
-      </w:r>
-    </w:p>
-    <w:p>
-      <w:pPr>
-        <w:pStyle w:val="toc2"/>
-      </w:pPr>
-      <w:r>
-        <w:t xml:space="preserve">4.7 The entry test and the extra sellers</w:t>
-      </w:r>
-      <w:r>
-        <w:tab/>
-      </w:r>
-      <w:r>
-        <w:t xml:space="preserve">24</w:t>
-      </w:r>
-    </w:p>
-    <w:p>
-      <w:pPr>
-        <w:pStyle w:val="toc2"/>
-      </w:pPr>
-      <w:r>
-        <w:t xml:space="preserve">4.8 Channels, records and reach</w:t>
-      </w:r>
-      <w:r>
-        <w:tab/>
-      </w:r>
-      <w:r>
-        <w:t xml:space="preserve">25</w:t>
-      </w:r>
-    </w:p>
-    <w:p>
-      <w:pPr>
-        <w:pStyle w:val="toc2"/>
-      </w:pPr>
-      <w:r>
-        <w:t xml:space="preserve">4.9 Comparing national figures</w:t>
-      </w:r>
-      <w:r>
-        <w:tab/>
-      </w:r>
-      <w:r>
-        <w:t xml:space="preserve">26</w:t>
-      </w:r>
-    </w:p>
-    <w:p>
-      <w:pPr>
-        <w:pStyle w:val="toc2"/>
-      </w:pPr>
-      <w:r>
-        <w:t xml:space="preserve">4.10 Labels, traceability and licensed data</w:t>
-      </w:r>
-      <w:r>
-        <w:tab/>
-      </w:r>
-      <w:r>
-        <w:t xml:space="preserve">27</w:t>
-      </w:r>
-    </w:p>
-    <w:p>
-      <w:pPr>
-        <w:pStyle w:val="toc1"/>
-      </w:pPr>
-      <w:r>
-        <w:t xml:space="preserve">Chapter 5 Results</w:t>
-      </w:r>
-      <w:r>
-        <w:tab/>
-      </w:r>
-      <w:r>
-        <w:t xml:space="preserve">28</w:t>
-      </w:r>
-    </w:p>
-    <w:p>
-      <w:pPr>
-        <w:pStyle w:val="toc2"/>
-      </w:pPr>
-      <w:r>
-        <w:t xml:space="preserve">5.1 How much revenue leaves out</w:t>
-      </w:r>
-      <w:r>
-        <w:tab/>
-      </w:r>
-      <w:r>
-        <w:t xml:space="preserve">29</w:t>
-      </w:r>
-    </w:p>
-    <w:p>
-      <w:pPr>
-        <w:pStyle w:val="toc2"/>
-      </w:pPr>
-      <w:r>
-        <w:t xml:space="preserve">5.2 Testing H1</w:t>
-      </w:r>
-      <w:r>
-        <w:tab/>
-      </w:r>
-      <w:r>
-        <w:t xml:space="preserve">30</w:t>
-      </w:r>
-    </w:p>
-    <w:p>
-      <w:pPr>
-        <w:pStyle w:val="toc2"/>
-      </w:pPr>
-      <w:r>
-        <w:t xml:space="preserve">5.3 What moved the take rate</w:t>
-      </w:r>
-      <w:r>
-        <w:tab/>
-      </w:r>
-      <w:r>
-        <w:t xml:space="preserve">32</w:t>
-      </w:r>
-    </w:p>
-    <w:p>
-      <w:pPr>
-        <w:pStyle w:val="toc2"/>
-      </w:pPr>
-      <w:r>
-        <w:t xml:space="preserve">5.4 What markets valued</w:t>
-      </w:r>
-      <w:r>
-        <w:tab/>
-      </w:r>
-      <w:r>
-        <w:t xml:space="preserve">34</w:t>
-      </w:r>
-    </w:p>
-    <w:p>
-      <w:pPr>
-        <w:pStyle w:val="toc2"/>
-      </w:pPr>
-      <w:r>
-        <w:t xml:space="preserve">5.5 The platforms and the sellers in 2023</w:t>
-      </w:r>
-      <w:r>
-        <w:tab/>
-      </w:r>
-      <w:r>
-        <w:t xml:space="preserve">35</w:t>
-      </w:r>
-    </w:p>
-    <w:p>
-      <w:pPr>
-        <w:pStyle w:val="toc2"/>
-      </w:pPr>
-      <w:r>
-        <w:t xml:space="preserve">5.6 H2 and the entry test</w:t>
-      </w:r>
-      <w:r>
-        <w:tab/>
-      </w:r>
-      <w:r>
-        <w:t xml:space="preserve">36</w:t>
-      </w:r>
-    </w:p>
-    <w:p>
-      <w:pPr>
-        <w:pStyle w:val="toc2"/>
-      </w:pPr>
-      <w:r>
-        <w:t xml:space="preserve">5.7 What the rise in the count contains</w:t>
-      </w:r>
-      <w:r>
-        <w:tab/>
-      </w:r>
-      <w:r>
-        <w:t xml:space="preserve">36</w:t>
-      </w:r>
-    </w:p>
-    <w:p>
-      <w:pPr>
-        <w:pStyle w:val="toc2"/>
-      </w:pPr>
-      <w:r>
-        <w:t xml:space="preserve">5.8 Who the extra sellers were</w:t>
-      </w:r>
-      <w:r>
-        <w:tab/>
-      </w:r>
-      <w:r>
-        <w:t xml:space="preserve">38</w:t>
-      </w:r>
-    </w:p>
-    <w:p>
-      <w:pPr>
-        <w:pStyle w:val="toc2"/>
-      </w:pPr>
-      <w:r>
-        <w:t xml:space="preserve">5.9 Channels and records</w:t>
-      </w:r>
-      <w:r>
-        <w:tab/>
-      </w:r>
-      <w:r>
-        <w:t xml:space="preserve">39</w:t>
-      </w:r>
-    </w:p>
-    <w:p>
-      <w:pPr>
-        <w:pStyle w:val="toc2"/>
-      </w:pPr>
-      <w:r>
-        <w:t xml:space="preserve">5.10 Why the national figures disagree</w:t>
-      </w:r>
-      <w:r>
-        <w:tab/>
-      </w:r>
-      <w:r>
-        <w:t xml:space="preserve">41</w:t>
-      </w:r>
-    </w:p>
-    <w:p>
-      <w:pPr>
-        <w:pStyle w:val="toc1"/>
-      </w:pPr>
-      <w:r>
-        <w:t xml:space="preserve">Chapter 6 Discussion and Policy Implications</w:t>
-      </w:r>
-      <w:r>
-        <w:tab/>
-      </w:r>
-      <w:r>
-        <w:t xml:space="preserve">43</w:t>
-      </w:r>
-    </w:p>
-    <w:p>
-      <w:pPr>
-        <w:pStyle w:val="toc2"/>
-      </w:pPr>
-      <w:r>
-        <w:t xml:space="preserve">6.1 The rules and what each acts on</w:t>
-      </w:r>
-      <w:r>
-        <w:tab/>
-      </w:r>
-      <w:r>
-        <w:t xml:space="preserve">43</w:t>
-      </w:r>
-    </w:p>
-    <w:p>
-      <w:pPr>
-        <w:pStyle w:val="toc2"/>
-      </w:pPr>
-      <w:r>
-        <w:t xml:space="preserve">6.2 What the commission cap and the discount rule can move</w:t>
-      </w:r>
-      <w:r>
-        <w:tab/>
-      </w:r>
-      <w:r>
-        <w:t xml:space="preserve">45</w:t>
-      </w:r>
-    </w:p>
-    <w:p>
-      <w:pPr>
-        <w:pStyle w:val="toc2"/>
-      </w:pPr>
-      <w:r>
-        <w:t xml:space="preserve">6.3 How far the marketplace tax reaches</w:t>
-      </w:r>
-      <w:r>
-        <w:tab/>
-      </w:r>
-      <w:r>
-        <w:t xml:space="preserve">46</w:t>
-      </w:r>
-    </w:p>
-    <w:p>
-      <w:pPr>
-        <w:pStyle w:val="toc2"/>
-      </w:pPr>
-      <w:r>
-        <w:t xml:space="preserve">6.4 What the statistics rules can change</w:t>
-      </w:r>
-      <w:r>
-        <w:tab/>
-      </w:r>
-      <w:r>
-        <w:t xml:space="preserve">48</w:t>
-      </w:r>
-    </w:p>
-    <w:p>
-      <w:pPr>
-        <w:pStyle w:val="toc2"/>
-      </w:pPr>
-      <w:r>
-        <w:t xml:space="preserve">6.5 What the registered predictions test</w:t>
-      </w:r>
-      <w:r>
-        <w:tab/>
-      </w:r>
-      <w:r>
-        <w:t xml:space="preserve">48</w:t>
-      </w:r>
-    </w:p>
-    <w:p>
-      <w:pPr>
-        <w:pStyle w:val="toc2"/>
-      </w:pPr>
-      <w:r>
-        <w:t xml:space="preserve">6.6 Beyond Indonesia</w:t>
-      </w:r>
-      <w:r>
-        <w:tab/>
-      </w:r>
-      <w:r>
-        <w:t xml:space="preserve">49</w:t>
-      </w:r>
-    </w:p>
-    <w:p>
-      <w:pPr>
-        <w:pStyle w:val="toc1"/>
-      </w:pPr>
-      <w:r>
-        <w:t xml:space="preserve">Chapter 7 Conclusion</w:t>
-      </w:r>
-      <w:r>
-        <w:tab/>
-      </w:r>
-      <w:r>
-        <w:t xml:space="preserve">51</w:t>
-      </w:r>
-    </w:p>
-    <w:p>
-      <w:pPr>
-        <w:pStyle w:val="toc2"/>
-      </w:pPr>
-      <w:r>
-        <w:t xml:space="preserve">7.1 The answer to the research question</w:t>
-      </w:r>
-      <w:r>
-        <w:tab/>
-      </w:r>
-      <w:r>
-        <w:t xml:space="preserve">51</w:t>
-      </w:r>
-    </w:p>
-    <w:p>
-      <w:pPr>
-        <w:pStyle w:val="toc2"/>
-      </w:pPr>
-      <w:r>
-        <w:t xml:space="preserve">7.2 What the thesis adds</w:t>
-      </w:r>
-      <w:r>
-        <w:tab/>
-      </w:r>
-      <w:r>
-        <w:t xml:space="preserve">52</w:t>
-      </w:r>
-    </w:p>
-    <w:p>
-      <w:pPr>
-        <w:pStyle w:val="toc2"/>
-      </w:pPr>
-      <w:r>
-        <w:t xml:space="preserve">7.3 Predictions that failed</w:t>
-      </w:r>
-      <w:r>
-        <w:tab/>
-      </w:r>
-      <w:r>
-        <w:t xml:space="preserve">53</w:t>
-      </w:r>
-    </w:p>
-    <w:p>
-      <w:pPr>
-        <w:pStyle w:val="toc2"/>
-      </w:pPr>
-      <w:r>
-        <w:t xml:space="preserve">7.4 Limits of the evidence</w:t>
-      </w:r>
-      <w:r>
-        <w:tab/>
-      </w:r>
-      <w:r>
-        <w:t xml:space="preserve">54</w:t>
-      </w:r>
-    </w:p>
-    <w:p>
-      <w:pPr>
-        <w:pStyle w:val="toc2"/>
-      </w:pPr>
-      <w:r>
-        <w:t xml:space="preserve">7.5 Further research</w:t>
-      </w:r>
-      <w:r>
-        <w:tab/>
-      </w:r>
-      <w:r>
-        <w:t xml:space="preserve">56</w:t>
-      </w:r>
-    </w:p>
-    <w:p>
-      <w:pPr>
-        <w:pStyle w:val="toc1"/>
-      </w:pPr>
-      <w:r>
-        <w:t xml:space="preserve">Appendices</w:t>
-      </w:r>
-      <w:r>
-        <w:tab/>
-      </w:r>
-      <w:r>
-        <w:t xml:space="preserve">57</w:t>
-      </w:r>
-    </w:p>
-    <w:p>
-      <w:pPr>
-        <w:pStyle w:val="toc2"/>
-      </w:pPr>
-      <w:r>
-        <w:t xml:space="preserve">Appendix A. Platforms, windows and the wedge by year</w:t>
-      </w:r>
-      <w:r>
-        <w:tab/>
-      </w:r>
-      <w:r>
-        <w:t xml:space="preserve">57</w:t>
-      </w:r>
-    </w:p>
-    <w:p>
-      <w:pPr>
-        <w:pStyle w:val="toc2"/>
-      </w:pPr>
-      <w:r>
-        <w:t xml:space="preserve">Appendix B. The checks on the test of H1</w:t>
-      </w:r>
-      <w:r>
-        <w:tab/>
-      </w:r>
-      <w:r>
-        <w:t xml:space="preserve">60</w:t>
-      </w:r>
-    </w:p>
-    <w:p>
-      <w:pPr>
-        <w:pStyle w:val="toc2"/>
-      </w:pPr>
-      <w:r>
-        <w:t xml:space="preserve">Appendix C. Registered tests and their outcomes</w:t>
-      </w:r>
-      <w:r>
-        <w:tab/>
-      </w:r>
-      <w:r>
-        <w:t xml:space="preserve">63</w:t>
-      </w:r>
-    </w:p>
-    <w:p>
-      <w:pPr>
-        <w:pStyle w:val="toc2"/>
-      </w:pPr>
-      <w:r>
-        <w:t xml:space="preserve">Appendix D. The values behind Figures 4 to 6</w:t>
-      </w:r>
-      <w:r>
-        <w:tab/>
-      </w:r>
-      <w:r>
-        <w:t xml:space="preserve">65</w:t>
-      </w:r>
-    </w:p>
-    <w:p>
-      <w:pPr>
-        <w:pStyle w:val="toc1"/>
-      </w:pPr>
-      <w:r>
-        <w:t xml:space="preserve">References</w:t>
-      </w:r>
-      <w:r>
-        <w:tab/>
-      </w:r>
-      <w:r>
-        <w:t xml:space="preserve">67</w:t>
-      </w:r>
-      <w:r>
-        <w:fldChar w:fldCharType="end"/>
-      </w:r>
-    </w:p>
-    <w:p>
-      <w:pPr>
-        <w:pStyle w:val="FrontHeading"/>
-      </w:pPr>
-      <w:r>
-        <w:t xml:space="preserve">List of Tables</w:t>
-      </w:r>
-    </w:p>
-    <w:p>
-      <w:pPr>
-        <w:pStyle w:val="tableoffigures"/>
-      </w:pPr>
-      <w:r>
-        <w:fldChar w:fldCharType="begin"/>
-      </w:r>
-      <w:r>
-        <w:instrText xml:space="preserve">TOC \t "Table Caption,1"</w:instrText>
-      </w:r>
-      <w:r>
-        <w:fldChar w:fldCharType="separate"/>
-      </w:r>
-      <w:r>
-        <w:t xml:space="preserve">Table 1. What the literature establishes and where it stops</w:t>
-      </w:r>
-      <w:r>
-        <w:tab/>
-      </w:r>
-      <w:r>
-        <w:t xml:space="preserve">8</w:t>
-      </w:r>
-    </w:p>
-    <w:p>
-      <w:pPr>
-        <w:pStyle w:val="tableoffigures"/>
-      </w:pPr>
-      <w:r>
-        <w:t xml:space="preserve">Table 2. Terms and symbols</w:t>
-      </w:r>
-      <w:r>
-        <w:tab/>
-      </w:r>
-      <w:r>
-        <w:t xml:space="preserve">10</w:t>
-      </w:r>
-    </w:p>
-    <w:p>
-      <w:pPr>
-        <w:pStyle w:val="tableoffigures"/>
-      </w:pPr>
-      <w:r>
-        <w:t xml:space="preserve">Table 3. Hypotheses, tests and what would count against them</w:t>
-      </w:r>
-      <w:r>
-        <w:tab/>
-      </w:r>
-      <w:r>
-        <w:t xml:space="preserve">14</w:t>
-      </w:r>
-    </w:p>
-    <w:p>
-      <w:pPr>
-        <w:pStyle w:val="tableoffigures"/>
-      </w:pPr>
-      <w:r>
-        <w:t xml:space="preserve">Table 4. Further analyses</w:t>
-      </w:r>
-      <w:r>
-        <w:tab/>
-      </w:r>
-      <w:r>
-        <w:t xml:space="preserve">17</w:t>
-      </w:r>
-    </w:p>
-    <w:p>
-      <w:pPr>
-        <w:pStyle w:val="tableoffigures"/>
-      </w:pPr>
-      <w:r>
-        <w:t xml:space="preserve">Table 5. The Indonesian and regional group of platforms</w:t>
-      </w:r>
-      <w:r>
-        <w:tab/>
-      </w:r>
-      <w:r>
-        <w:t xml:space="preserve">20</w:t>
-      </w:r>
-    </w:p>
-    <w:p>
-      <w:pPr>
-        <w:pStyle w:val="tableoffigures"/>
-      </w:pPr>
-      <w:r>
-        <w:t xml:space="preserve">Table 6. The three BPS survey files</w:t>
-      </w:r>
-      <w:r>
-        <w:tab/>
-      </w:r>
-      <w:r>
-        <w:t xml:space="preserve">24</w:t>
-      </w:r>
-    </w:p>
-    <w:p>
-      <w:pPr>
-        <w:pStyle w:val="tableoffigures"/>
-      </w:pPr>
-      <w:r>
-        <w:t xml:space="preserve">Table 7. Sources compared in Objective 3</w:t>
-      </w:r>
-      <w:r>
-        <w:tab/>
-      </w:r>
-      <w:r>
-        <w:t xml:space="preserve">26</w:t>
-      </w:r>
-    </w:p>
-    <w:p>
-      <w:pPr>
-        <w:pStyle w:val="tableoffigures"/>
-      </w:pPr>
-      <w:r>
-        <w:t xml:space="preserve">Table 8. Main results and the evidence behind them</w:t>
-      </w:r>
-      <w:r>
-        <w:tab/>
-      </w:r>
-      <w:r>
-        <w:t xml:space="preserve">28</w:t>
-      </w:r>
-    </w:p>
-    <w:p>
-      <w:pPr>
-        <w:pStyle w:val="tableoffigures"/>
-      </w:pPr>
-      <w:r>
-        <w:t xml:space="preserve">Table 9. The invisible wedge of three platforms, 2023 (US$ billion)</w:t>
-      </w:r>
-      <w:r>
-        <w:tab/>
-      </w:r>
-      <w:r>
-        <w:t xml:space="preserve">29</w:t>
-      </w:r>
-    </w:p>
-    <w:p>
-      <w:pPr>
-        <w:pStyle w:val="tableoffigures"/>
-      </w:pPr>
-      <w:r>
-        <w:t xml:space="preserve">Table 10. The test of H1</w:t>
-      </w:r>
-      <w:r>
-        <w:tab/>
-      </w:r>
-      <w:r>
-        <w:t xml:space="preserve">30</w:t>
-      </w:r>
-    </w:p>
-    <w:p>
-      <w:pPr>
-        <w:pStyle w:val="tableoffigures"/>
-      </w:pPr>
-      <w:r>
-        <w:t xml:space="preserve">Table 11. What moved revenue in seven Indonesian and regional windows (share of the growth of revenue, percent)</w:t>
-      </w:r>
-      <w:r>
-        <w:tab/>
-      </w:r>
-      <w:r>
-        <w:t xml:space="preserve">33</w:t>
-      </w:r>
-    </w:p>
-    <w:p>
-      <w:pPr>
-        <w:pStyle w:val="tableoffigures"/>
-      </w:pPr>
-      <w:r>
-        <w:t xml:space="preserve">Table 12. The 2023 rise in the count of online sellers (thousands)</w:t>
-      </w:r>
-      <w:r>
-        <w:tab/>
-      </w:r>
-      <w:r>
-        <w:t xml:space="preserve">36</w:t>
-      </w:r>
-    </w:p>
-    <w:p>
-      <w:pPr>
-        <w:pStyle w:val="tableoffigures"/>
-      </w:pPr>
-      <w:r>
-        <w:t xml:space="preserve">Table 13. Indonesia’s recent rules and what each acts on</w:t>
-      </w:r>
-      <w:r>
-        <w:tab/>
-      </w:r>
-      <w:r>
-        <w:t xml:space="preserve">43</w:t>
-      </w:r>
-    </w:p>
-    <w:p>
-      <w:pPr>
-        <w:pStyle w:val="tableoffigures"/>
-      </w:pPr>
-      <w:r>
-        <w:t xml:space="preserve">Table 14. Registered predictions on the 2026 rules</w:t>
-      </w:r>
-      <w:r>
-        <w:tab/>
-      </w:r>
-      <w:r>
-        <w:t xml:space="preserve">48</w:t>
-      </w:r>
-      <w:r>
-        <w:fldChar w:fldCharType="end"/>
-      </w:r>
-    </w:p>
-    <w:p>
-      <w:pPr>
-        <w:pStyle w:val="FrontHeading"/>
-      </w:pPr>
-      <w:r>
-        <w:t xml:space="preserve">List of Figures</w:t>
-      </w:r>
-    </w:p>
-    <w:p>
-      <w:pPr>
-        <w:pStyle w:val="tableoffigures"/>
-      </w:pPr>
-      <w:r>
-        <w:fldChar w:fldCharType="begin"/>
-      </w:r>
-      <w:r>
-        <w:instrText xml:space="preserve">TOC \t "Figure Caption,1"</w:instrText>
-      </w:r>
-      <w:r>
-        <w:fldChar w:fldCharType="separate"/>
-      </w:r>
-      <w:r>
-        <w:t xml:space="preserve">Figure 1. Three nested quantities and the two links.</w:t>
-      </w:r>
-      <w:r>
-        <w:tab/>
-      </w:r>
-      <w:r>
-        <w:t xml:space="preserve">9</w:t>
       </w:r>
     </w:p>
     <w:p>
@@ -3694,6 +3694,7 @@
     <w:p>
       <w:pPr>
         <w:pStyle w:val="FigureCaption"/>
+        <w:keepNext/>
       </w:pPr>
       <w:r>
         <w:rPr>
@@ -11347,6 +11348,7 @@
     <w:p>
       <w:pPr>
         <w:pStyle w:val="FigureCaption"/>
+        <w:keepNext/>
       </w:pPr>
       <w:r>
         <w:rPr>
@@ -12315,6 +12317,7 @@
     <w:p>
       <w:pPr>
         <w:pStyle w:val="FigureCaption"/>
+        <w:keepNext/>
       </w:pPr>
       <w:r>
         <w:rPr>
@@ -12503,6 +12506,7 @@
     <w:p>
       <w:pPr>
         <w:pStyle w:val="FigureCaption"/>
+        <w:keepNext/>
       </w:pPr>
       <w:r>
         <w:rPr>
@@ -13045,6 +13049,7 @@
     <w:p>
       <w:pPr>
         <w:pStyle w:val="FigureCaption"/>
+        <w:keepNext/>
       </w:pPr>
       <w:r>
         <w:rPr>
@@ -13202,6 +13207,7 @@
     <w:p>
       <w:pPr>
         <w:pStyle w:val="FigureCaption"/>
+        <w:keepNext/>
       </w:pPr>
       <w:r>
         <w:rPr>

</xml_diff>

<commit_message>
YZU file: figures lettered in Times New Roman
The six figures were images in Source Serif 4, unlike the Times New Roman
body. The figure scripts now take a font and output folder; the YZU build
uses Times New Roman versions in figures_yzu/. Same values. 83 pages.

Co-Authored-By: Claude Sonnet 5.5 <noreply@anthropic.com>
Claude-Session: https://claude.ai/code/session_01XxH9J9TaLYfAYFCaGAqS9y
</commit_message>
<xml_diff>
--- a/papers/thesis_2026-10/reading/thesis_YZU_layout_2026-10-24.docx
+++ b/papers/thesis_2026-10/reading/thesis_YZU_layout_2026-10-24.docx
@@ -3698,7 +3698,7 @@
               <a:graphicData uri="http://schemas.openxmlformats.org/drawingml/2006/picture">
                 <pic:pic>
                   <pic:nvPicPr>
-                    <pic:cNvPr descr="figures/fig3_1_two_links.png" id="31" name="Picture"/>
+                    <pic:cNvPr descr="figures_yzu/fig3_1_two_links.png" id="31" name="Picture"/>
                     <pic:cNvPicPr>
                       <a:picLocks noChangeArrowheads="1" noChangeAspect="1"/>
                     </pic:cNvPicPr>
@@ -11514,7 +11514,7 @@
               <a:graphicData uri="http://schemas.openxmlformats.org/drawingml/2006/picture">
                 <pic:pic>
                   <pic:nvPicPr>
-                    <pic:cNvPr descr="figures/fig5_1_thin_slice.png" id="53" name="Picture"/>
+                    <pic:cNvPr descr="figures_yzu/fig5_1_thin_slice.png" id="53" name="Picture"/>
                     <pic:cNvPicPr>
                       <a:picLocks noChangeArrowheads="1" noChangeAspect="1"/>
                     </pic:cNvPicPr>
@@ -12511,14 +12511,14 @@
       <w:r>
         <w:drawing>
           <wp:inline>
-            <wp:extent cx="5400000" cy="1791704"/>
+            <wp:extent cx="5400000" cy="1826209"/>
             <wp:effectExtent b="0" l="0" r="0" t="0"/>
             <wp:docPr descr="" title="" id="56" name="Picture"/>
             <a:graphic>
               <a:graphicData uri="http://schemas.openxmlformats.org/drawingml/2006/picture">
                 <pic:pic>
                   <pic:nvPicPr>
-                    <pic:cNvPr descr="figures/fig5_2_tokopedia_two_views.png" id="57" name="Picture"/>
+                    <pic:cNvPr descr="figures_yzu/fig5_2_tokopedia_two_views.png" id="57" name="Picture"/>
                     <pic:cNvPicPr>
                       <a:picLocks noChangeArrowheads="1" noChangeAspect="1"/>
                     </pic:cNvPicPr>
@@ -12532,7 +12532,7 @@
                   <pic:spPr bwMode="auto">
                     <a:xfrm>
                       <a:off x="0" y="0"/>
-                      <a:ext cx="5400000" cy="1791704"/>
+                      <a:ext cx="5400000" cy="1826209"/>
                     </a:xfrm>
                     <a:prstGeom prst="rect">
                       <a:avLst/>
@@ -12700,14 +12700,14 @@
       <w:r>
         <w:drawing>
           <wp:inline>
-            <wp:extent cx="5400000" cy="2890140"/>
+            <wp:extent cx="5400000" cy="2891497"/>
             <wp:effectExtent b="0" l="0" r="0" t="0"/>
             <wp:docPr descr="" title="" id="61" name="Picture"/>
             <a:graphic>
               <a:graphicData uri="http://schemas.openxmlformats.org/drawingml/2006/picture">
                 <pic:pic>
                   <pic:nvPicPr>
-                    <pic:cNvPr descr="figures/fig5_3_growth_2023.png" id="62" name="Picture"/>
+                    <pic:cNvPr descr="figures_yzu/fig5_3_growth_2023.png" id="62" name="Picture"/>
                     <pic:cNvPicPr>
                       <a:picLocks noChangeArrowheads="1" noChangeAspect="1"/>
                     </pic:cNvPicPr>
@@ -12721,7 +12721,7 @@
                   <pic:spPr bwMode="auto">
                     <a:xfrm>
                       <a:off x="0" y="0"/>
-                      <a:ext cx="5400000" cy="2890140"/>
+                      <a:ext cx="5400000" cy="2891497"/>
                     </a:xfrm>
                     <a:prstGeom prst="rect">
                       <a:avLst/>
@@ -13259,7 +13259,7 @@
               <a:graphicData uri="http://schemas.openxmlformats.org/drawingml/2006/picture">
                 <pic:pic>
                   <pic:nvPicPr>
-                    <pic:cNvPr descr="figures/fig5_4_extra_sellers.png" id="68" name="Picture"/>
+                    <pic:cNvPr descr="figures_yzu/fig5_4_extra_sellers.png" id="68" name="Picture"/>
                     <pic:cNvPicPr>
                       <a:picLocks noChangeArrowheads="1" noChangeAspect="1"/>
                     </pic:cNvPicPr>
@@ -13410,14 +13410,14 @@
       <w:r>
         <w:drawing>
           <wp:inline>
-            <wp:extent cx="5400000" cy="2475737"/>
+            <wp:extent cx="5400000" cy="2480043"/>
             <wp:effectExtent b="0" l="0" r="0" t="0"/>
             <wp:docPr descr="" title="" id="71" name="Picture"/>
             <a:graphic>
               <a:graphicData uri="http://schemas.openxmlformats.org/drawingml/2006/picture">
                 <pic:pic>
                   <pic:nvPicPr>
-                    <pic:cNvPr descr="figures/fig5_5_marketplace_and_records.png" id="72" name="Picture"/>
+                    <pic:cNvPr descr="figures_yzu/fig5_5_marketplace_and_records.png" id="72" name="Picture"/>
                     <pic:cNvPicPr>
                       <a:picLocks noChangeArrowheads="1" noChangeAspect="1"/>
                     </pic:cNvPicPr>
@@ -13431,7 +13431,7 @@
                   <pic:spPr bwMode="auto">
                     <a:xfrm>
                       <a:off x="0" y="0"/>
-                      <a:ext cx="5400000" cy="2475737"/>
+                      <a:ext cx="5400000" cy="2480043"/>
                     </a:xfrm>
                     <a:prstGeom prst="rect">
                       <a:avLst/>

</xml_diff>

<commit_message>
YZU file: cover, YZU title page, English abstract header, front contents entries
Built from the templates Prof. Kong sent (identical to the official YZU
downloads already in the repository). Cover and title page use the Chinese
title and names from the 27 Sep proposal cover; program and degree wording
to be confirmed. 84 pages; contents and page numbers re-verified.

Co-Authored-By: Claude Sonnet 5.5 <noreply@anthropic.com>
Claude-Session: https://claude.ai/code/session_01XxH9J9TaLYfAYFCaGAqS9y
</commit_message>
<xml_diff>
--- a/papers/thesis_2026-10/reading/thesis_YZU_layout_2026-10-24.docx
+++ b/papers/thesis_2026-10/reading/thesis_YZU_layout_2026-10-24.docx
@@ -4,190 +4,266 @@
   <w:body>
     <w:p>
       <w:pPr>
-        <w:pStyle w:val="Title"/>
-      </w:pPr>
-      <w:r>
-        <w:t xml:space="preserve">The</w:t>
-      </w:r>
-      <w:r>
-        <w:t xml:space="preserve"> </w:t>
-      </w:r>
-      <w:r>
-        <w:t xml:space="preserve">Invisible</w:t>
-      </w:r>
-      <w:r>
-        <w:t xml:space="preserve"> </w:t>
-      </w:r>
-      <w:r>
-        <w:t xml:space="preserve">Ledger:</w:t>
-      </w:r>
-      <w:r>
-        <w:t xml:space="preserve"> </w:t>
-      </w:r>
-      <w:r>
-        <w:t xml:space="preserve">Quantifying</w:t>
-      </w:r>
-      <w:r>
-        <w:t xml:space="preserve"> </w:t>
-      </w:r>
-      <w:r>
-        <w:t xml:space="preserve">the</w:t>
-      </w:r>
-      <w:r>
-        <w:t xml:space="preserve"> </w:t>
-      </w:r>
-      <w:r>
-        <w:t xml:space="preserve">Invisible</w:t>
-      </w:r>
-      <w:r>
-        <w:t xml:space="preserve"> </w:t>
-      </w:r>
-      <w:r>
-        <w:t xml:space="preserve">Wedge</w:t>
-      </w:r>
-      <w:r>
-        <w:t xml:space="preserve"> </w:t>
-      </w:r>
+        <w:pStyle w:val="CoverUniversity"/>
+      </w:pPr>
+      <w:r>
+        <w:t xml:space="preserve">元智大學</w:t>
+      </w:r>
+    </w:p>
+    <w:p>
+      <w:pPr>
+        <w:pStyle w:val="CoverDept"/>
+      </w:pPr>
+      <w:r>
+        <w:t xml:space="preserve">管理學院財務金融暨會計碩士班</w:t>
+      </w:r>
+    </w:p>
+    <w:p>
+      <w:pPr>
+        <w:pStyle w:val="CoverTrack"/>
+      </w:pPr>
+      <w:r>
+        <w:t xml:space="preserve">財務金融碩士學程</w:t>
+      </w:r>
+    </w:p>
+    <w:p>
+      <w:pPr>
+        <w:pStyle w:val="CoverDegree"/>
+      </w:pPr>
+      <w:r>
+        <w:t xml:space="preserve">碩士論文</w:t>
+      </w:r>
+    </w:p>
+    <w:p>
+      <w:pPr>
+        <w:pStyle w:val="CoverTitle"/>
+      </w:pPr>
+      <w:r>
+        <w:t xml:space="preserve">隱形帳簿：量化印尼平台經濟中的隱形缺口</w:t>
+      </w:r>
+    </w:p>
+    <w:p>
+      <w:pPr>
+        <w:pStyle w:val="CoverPerson"/>
+      </w:pPr>
+      <w:r>
+        <w:t xml:space="preserve">研究生：王新福</w:t>
+      </w:r>
+    </w:p>
+    <w:p>
+      <w:pPr>
+        <w:pStyle w:val="CoverPersonNext"/>
+      </w:pPr>
+      <w:r>
+        <w:t xml:space="preserve">指導教授：孔德蓉</w:t>
+      </w:r>
+    </w:p>
+    <w:p>
+      <w:pPr>
+        <w:pStyle w:val="CoverDate"/>
+      </w:pPr>
+      <w:r>
+        <w:t xml:space="preserve">中華民國 115 年 10 月</w:t>
+      </w:r>
+    </w:p>
+    <w:p>
+      <w:pPr>
+        <w:sectPr>
+          <w:pgSz w:h="16838" w:w="11906"/>
+          <w:pgMar w:bottom="1134" w:footer="567" w:header="850" w:left="2268" w:right="1134" w:top="1984"/>
+        </w:sectPr>
+      </w:pPr>
+    </w:p>
+    <w:p>
+      <w:pPr>
+        <w:pStyle w:val="TPTitle"/>
+      </w:pPr>
+      <w:r>
+        <w:t xml:space="preserve">隱形帳簿：量化印尼平台經濟中的隱形缺口</w:t>
+      </w:r>
+    </w:p>
+    <w:p>
+      <w:pPr>
+        <w:pStyle w:val="TPTitle"/>
+      </w:pPr>
+      <w:r>
+        <w:t xml:space="preserve">THE INVISIBLE LEDGER: QUANTIFYING THE INVISIBLE WEDGE IN INDONESIA’S PLATFORM ECONOMY</w:t>
+      </w:r>
+    </w:p>
+    <w:p>
+      <w:pPr>
+        <w:pStyle w:val="TPPeople"/>
+      </w:pPr>
+      <w:r>
+        <w:t xml:space="preserve">研究生：王新福 Student: Christopher Ongko</w:t>
+      </w:r>
+    </w:p>
+    <w:p>
+      <w:pPr>
+        <w:pStyle w:val="TPLine"/>
+      </w:pPr>
+      <w:r>
+        <w:t xml:space="preserve">指導教授：孔德蓉 Advisor: De-Rong Kong</w:t>
+      </w:r>
+    </w:p>
+    <w:p>
+      <w:pPr>
+        <w:pStyle w:val="TPGap"/>
+      </w:pPr>
+      <w:r>
+        <w:t xml:space="preserve">元智大學</w:t>
+      </w:r>
+    </w:p>
+    <w:p>
+      <w:pPr>
+        <w:pStyle w:val="TPLine"/>
+      </w:pPr>
+      <w:r>
+        <w:t xml:space="preserve">管理學院財務金融暨會計碩士班</w:t>
+      </w:r>
+    </w:p>
+    <w:p>
+      <w:pPr>
+        <w:pStyle w:val="TPLine"/>
+      </w:pPr>
+      <w:r>
+        <w:t xml:space="preserve">碩士論文</w:t>
+      </w:r>
+    </w:p>
+    <w:p>
+      <w:pPr>
+        <w:pStyle w:val="TPPeople"/>
+      </w:pPr>
+      <w:r>
+        <w:t xml:space="preserve">A Thesis</w:t>
+      </w:r>
+    </w:p>
+    <w:p>
+      <w:pPr>
+        <w:pStyle w:val="TPBlock"/>
+      </w:pPr>
+      <w:r>
+        <w:t xml:space="preserve">Submitted to MS Program in Finance and Accounting</w:t>
+      </w:r>
+    </w:p>
+    <w:p>
+      <w:pPr>
+        <w:pStyle w:val="TPBlock"/>
+      </w:pPr>
+      <w:r>
+        <w:t xml:space="preserve">College of Management</w:t>
+      </w:r>
+    </w:p>
+    <w:p>
+      <w:pPr>
+        <w:pStyle w:val="TPBlock"/>
+      </w:pPr>
+      <w:r>
+        <w:t xml:space="preserve">Yuan Ze University</w:t>
+      </w:r>
+    </w:p>
+    <w:p>
+      <w:pPr>
+        <w:pStyle w:val="TPBlock"/>
+      </w:pPr>
+      <w:r>
+        <w:t xml:space="preserve">in Partial Fulfillment of the Requirements</w:t>
+      </w:r>
+    </w:p>
+    <w:p>
+      <w:pPr>
+        <w:pStyle w:val="TPBlock"/>
+      </w:pPr>
+      <w:r>
+        <w:t xml:space="preserve">for the Degree of</w:t>
+      </w:r>
+    </w:p>
+    <w:p>
+      <w:pPr>
+        <w:pStyle w:val="TPBlock"/>
+      </w:pPr>
+      <w:r>
+        <w:t xml:space="preserve">Master of Science</w:t>
+      </w:r>
+    </w:p>
+    <w:p>
+      <w:pPr>
+        <w:pStyle w:val="TPBlock"/>
+      </w:pPr>
       <w:r>
         <w:t xml:space="preserve">in</w:t>
       </w:r>
-      <w:r>
-        <w:t xml:space="preserve"> </w:t>
-      </w:r>
-      <w:r>
-        <w:t xml:space="preserve">Indonesia’s</w:t>
-      </w:r>
-      <w:r>
-        <w:t xml:space="preserve"> </w:t>
-      </w:r>
-      <w:r>
-        <w:t xml:space="preserve">Platform</w:t>
-      </w:r>
-      <w:r>
-        <w:t xml:space="preserve"> </w:t>
-      </w:r>
-      <w:r>
-        <w:t xml:space="preserve">Economy</w:t>
-      </w:r>
-    </w:p>
-    <w:p>
-      <w:pPr>
-        <w:pStyle w:val="Subtitle"/>
-      </w:pPr>
-      <w:r>
-        <w:t xml:space="preserve">Master’s</w:t>
-      </w:r>
-      <w:r>
-        <w:t xml:space="preserve"> </w:t>
-      </w:r>
-      <w:r>
-        <w:t xml:space="preserve">thesis</w:t>
-      </w:r>
-    </w:p>
-    <w:p>
-      <w:pPr>
-        <w:pStyle w:val="Author"/>
-      </w:pPr>
-      <w:r>
-        <w:t xml:space="preserve">Christopher</w:t>
-      </w:r>
-      <w:r>
-        <w:t xml:space="preserve"> </w:t>
-      </w:r>
-      <w:r>
-        <w:t xml:space="preserve">Ongko</w:t>
-      </w:r>
-      <w:r>
-        <w:t xml:space="preserve"> </w:t>
-      </w:r>
-      <w:r>
-        <w:t xml:space="preserve">(王新福)</w:t>
-      </w:r>
-    </w:p>
-    <w:p>
-      <w:pPr>
-        <w:pStyle w:val="Author"/>
-      </w:pPr>
-      <w:r>
-        <w:t xml:space="preserve">Advisor:</w:t>
-      </w:r>
-      <w:r>
-        <w:t xml:space="preserve"> </w:t>
-      </w:r>
-      <w:r>
-        <w:t xml:space="preserve">Prof. De-Rong</w:t>
-      </w:r>
-      <w:r>
-        <w:t xml:space="preserve"> </w:t>
-      </w:r>
-      <w:r>
-        <w:t xml:space="preserve">Kong</w:t>
-      </w:r>
-      <w:r>
-        <w:t xml:space="preserve"> </w:t>
-      </w:r>
-      <w:r>
-        <w:t xml:space="preserve">(孔德蓉)</w:t>
-      </w:r>
-    </w:p>
-    <w:p>
-      <w:pPr>
-        <w:pStyle w:val="Author"/>
-      </w:pPr>
-      <w:r>
-        <w:t xml:space="preserve">College</w:t>
-      </w:r>
-      <w:r>
-        <w:t xml:space="preserve"> </w:t>
-      </w:r>
-      <w:r>
-        <w:t xml:space="preserve">of</w:t>
-      </w:r>
-      <w:r>
-        <w:t xml:space="preserve"> </w:t>
-      </w:r>
-      <w:r>
-        <w:t xml:space="preserve">Management,</w:t>
-      </w:r>
-      <w:r>
-        <w:t xml:space="preserve"> </w:t>
-      </w:r>
-      <w:r>
-        <w:t xml:space="preserve">Yuan</w:t>
-      </w:r>
-      <w:r>
-        <w:t xml:space="preserve"> </w:t>
-      </w:r>
-      <w:r>
-        <w:t xml:space="preserve">Ze</w:t>
-      </w:r>
-      <w:r>
-        <w:t xml:space="preserve"> </w:t>
-      </w:r>
-      <w:r>
-        <w:t xml:space="preserve">University</w:t>
-      </w:r>
-    </w:p>
-    <w:p>
-      <w:pPr>
-        <w:pStyle w:val="Date"/>
-      </w:pPr>
-      <w:r>
-        <w:t xml:space="preserve">October</w:t>
-      </w:r>
-      <w:r>
-        <w:t xml:space="preserve"> </w:t>
-      </w:r>
-      <w:r>
-        <w:t xml:space="preserve">2026</w:t>
-      </w:r>
-    </w:p>
-    <w:p>
-      <w:pPr>
-        <w:pStyle w:val="FrontHeading"/>
-      </w:pPr>
-      <w:r>
-        <w:t xml:space="preserve">Abstract</w:t>
+    </w:p>
+    <w:p>
+      <w:pPr>
+        <w:pStyle w:val="TPBlock"/>
+      </w:pPr>
+      <w:r>
+        <w:t xml:space="preserve">Finance and Accounting</w:t>
+      </w:r>
+    </w:p>
+    <w:p>
+      <w:pPr>
+        <w:pStyle w:val="TPBlock"/>
+      </w:pPr>
+      <w:r>
+        <w:t xml:space="preserve">October 2026</w:t>
+      </w:r>
+    </w:p>
+    <w:p>
+      <w:pPr>
+        <w:pStyle w:val="TPBlock"/>
+      </w:pPr>
+      <w:r>
+        <w:t xml:space="preserve">Chungli, Taiwan, Republic of China.</w:t>
+      </w:r>
+    </w:p>
+    <w:p>
+      <w:pPr>
+        <w:pStyle w:val="TPLine"/>
+      </w:pPr>
+      <w:r>
+        <w:t xml:space="preserve">中華民國 115 年 10 月</w:t>
+      </w:r>
+    </w:p>
+    <w:p>
+      <w:pPr>
+        <w:pStyle w:val="AbstractTitle"/>
+      </w:pPr>
+      <w:r>
+        <w:t xml:space="preserve">The Invisible Ledger: Quantifying the Invisible Wedge in Indonesia’s Platform Economy</w:t>
+      </w:r>
+    </w:p>
+    <w:p>
+      <w:pPr>
+        <w:pStyle w:val="AbstractHead"/>
+      </w:pPr>
+      <w:r>
+        <w:t xml:space="preserve">Student: Christopher Ongko 　 Advisor: Dr. De-Rong Kong</w:t>
+      </w:r>
+    </w:p>
+    <w:p>
+      <w:pPr>
+        <w:pStyle w:val="AbstractHead"/>
+      </w:pPr>
+      <w:r>
+        <w:t xml:space="preserve">Submitted to MS Program in Finance and Accounting</w:t>
+      </w:r>
+    </w:p>
+    <w:p>
+      <w:pPr>
+        <w:pStyle w:val="AbstractHead"/>
+      </w:pPr>
+      <w:r>
+        <w:t xml:space="preserve">College of Management, Yuan Ze University</w:t>
+      </w:r>
+    </w:p>
+    <w:p>
+      <w:pPr>
+        <w:pStyle w:val="AbstractLabel"/>
+      </w:pPr>
+      <w:r>
+        <w:t xml:space="preserve">ABSTRACT</w:t>
       </w:r>
     </w:p>
     <w:p>
@@ -238,6 +314,162 @@
       </w:pPr>
       <w:r>
         <w:t xml:space="preserve">Contents</w:t>
+      </w:r>
+    </w:p>
+    <w:p>
+      <w:pPr>
+        <w:pStyle w:val="toc1"/>
+        <w:rPr>
+          <w:b w:val="0"/>
+        </w:rPr>
+      </w:pPr>
+      <w:r>
+        <w:rPr>
+          <w:b w:val="0"/>
+        </w:rPr>
+        <w:t xml:space="preserve">Title Page</w:t>
+      </w:r>
+      <w:r>
+        <w:rPr>
+          <w:b w:val="0"/>
+        </w:rPr>
+        <w:tab/>
+      </w:r>
+      <w:r>
+        <w:rPr>
+          <w:b w:val="0"/>
+        </w:rPr>
+        <w:t xml:space="preserve">i</w:t>
+      </w:r>
+    </w:p>
+    <w:p>
+      <w:pPr>
+        <w:pStyle w:val="toc1"/>
+        <w:rPr>
+          <w:b w:val="0"/>
+        </w:rPr>
+      </w:pPr>
+      <w:r>
+        <w:rPr>
+          <w:b w:val="0"/>
+        </w:rPr>
+        <w:t xml:space="preserve">Abstract</w:t>
+      </w:r>
+      <w:r>
+        <w:rPr>
+          <w:b w:val="0"/>
+        </w:rPr>
+        <w:tab/>
+      </w:r>
+      <w:r>
+        <w:rPr>
+          <w:b w:val="0"/>
+        </w:rPr>
+        <w:t xml:space="preserve">ii</w:t>
+      </w:r>
+    </w:p>
+    <w:p>
+      <w:pPr>
+        <w:pStyle w:val="toc1"/>
+        <w:rPr>
+          <w:b w:val="0"/>
+        </w:rPr>
+      </w:pPr>
+      <w:r>
+        <w:rPr>
+          <w:b w:val="0"/>
+        </w:rPr>
+        <w:t xml:space="preserve">Table of Contents</w:t>
+      </w:r>
+      <w:r>
+        <w:rPr>
+          <w:b w:val="0"/>
+        </w:rPr>
+        <w:tab/>
+      </w:r>
+      <w:r>
+        <w:rPr>
+          <w:b w:val="0"/>
+        </w:rPr>
+        <w:t xml:space="preserve">iii</w:t>
+      </w:r>
+    </w:p>
+    <w:p>
+      <w:pPr>
+        <w:pStyle w:val="toc1"/>
+        <w:rPr>
+          <w:b w:val="0"/>
+        </w:rPr>
+      </w:pPr>
+      <w:r>
+        <w:rPr>
+          <w:b w:val="0"/>
+        </w:rPr>
+        <w:t xml:space="preserve">List of Tables</w:t>
+      </w:r>
+      <w:r>
+        <w:rPr>
+          <w:b w:val="0"/>
+        </w:rPr>
+        <w:tab/>
+      </w:r>
+      <w:r>
+        <w:rPr>
+          <w:b w:val="0"/>
+        </w:rPr>
+        <w:t xml:space="preserve">v</w:t>
+      </w:r>
+    </w:p>
+    <w:p>
+      <w:pPr>
+        <w:pStyle w:val="toc1"/>
+        <w:rPr>
+          <w:b w:val="0"/>
+        </w:rPr>
+      </w:pPr>
+      <w:r>
+        <w:rPr>
+          <w:b w:val="0"/>
+        </w:rPr>
+        <w:t xml:space="preserve">List of Figures</w:t>
+      </w:r>
+      <w:r>
+        <w:rPr>
+          <w:b w:val="0"/>
+        </w:rPr>
+        <w:tab/>
+      </w:r>
+      <w:r>
+        <w:rPr>
+          <w:b w:val="0"/>
+        </w:rPr>
+        <w:t xml:space="preserve">vi</w:t>
+      </w:r>
+    </w:p>
+    <w:p>
+      <w:pPr>
+        <w:pStyle w:val="toc1"/>
+        <w:rPr>
+          <w:b w:val="0"/>
+        </w:rPr>
+      </w:pPr>
+      <w:r>
+        <w:rPr>
+          <w:b w:val="0"/>
+        </w:rPr>
+        <w:t xml:space="preserve">Symbols and Abbreviations</w:t>
+      </w:r>
+      <w:r>
+        <w:rPr>
+          <w:b w:val="0"/>
+        </w:rPr>
+        <w:tab/>
+      </w:r>
+      <w:r>
+        <w:rPr>
+          <w:b w:val="0"/>
+        </w:rPr>
+        <w:t xml:space="preserve">vii</w:t>
       </w:r>
     </w:p>
     <w:p>
@@ -30564,14 +30796,16 @@
       <w:keepNext/>
       <w:keepLines/>
       <w:jc w:val="center"/>
-      <w:spacing w:after="0" w:before="300"/>
+      <w:pageBreakBefore/>
+      <w:spacing w:after="280" w:before="0" w:line="312" w:lineRule="auto"/>
     </w:pPr>
     <w:rPr>
-      <w:sz w:val="20"/>
+      <w:i w:val="0"/>
+      <w:color w:val="000000"/>
+      <w:sz w:val="28"/>
       <w:szCs w:val="20"/>
+      <w:rFonts w:ascii="Times New Roman" w:cs="Times New Roman" w:eastAsia="DFKai-SB" w:hAnsi="Times New Roman"/>
       <w:b/>
-      <w:color w:val="345A8A"/>
-      &gt;
     </w:rPr>
   </w:style>
   <w:style w:customStyle="1" w:styleId="Abstract" w:type="paragraph">
@@ -31031,6 +31265,233 @@
       <w:i w:val="0"/>
       <w:color w:val="000000"/>
       <w:sz w:val="19"/>
+    </w:rPr>
+  </w:style>
+  <w:style w:customStyle="1" w:styleId="CoverUniversity" w:type="paragraph">
+    <w:name w:val="Cover University"/>
+    <w:basedOn w:val="Normal"/>
+    <w:pPr>
+      <w:spacing w:after="0" w:before="800" w:line="240" w:lineRule="auto"/>
+      <w:jc w:val="center"/>
+    </w:pPr>
+    <w:rPr>
+      <w:rFonts w:ascii="Times New Roman" w:cs="Times New Roman" w:eastAsia="DFKai-SB" w:hAnsi="Times New Roman"/>
+      <w:b w:val="0"/>
+      <w:i w:val="0"/>
+      <w:color w:val="000000"/>
+      <w:sz w:val="48"/>
+    </w:rPr>
+  </w:style>
+  <w:style w:customStyle="1" w:styleId="CoverDept" w:type="paragraph">
+    <w:name w:val="Cover Dept"/>
+    <w:basedOn w:val="Normal"/>
+    <w:pPr>
+      <w:spacing w:after="120" w:before="840" w:line="240" w:lineRule="auto"/>
+      <w:jc w:val="center"/>
+    </w:pPr>
+    <w:rPr>
+      <w:rFonts w:ascii="Times New Roman" w:cs="Times New Roman" w:eastAsia="DFKai-SB" w:hAnsi="Times New Roman"/>
+      <w:b w:val="0"/>
+      <w:i w:val="0"/>
+      <w:color w:val="000000"/>
+      <w:sz w:val="56"/>
+    </w:rPr>
+  </w:style>
+  <w:style w:customStyle="1" w:styleId="CoverTrack" w:type="paragraph">
+    <w:name w:val="Cover Track"/>
+    <w:basedOn w:val="Normal"/>
+    <w:pPr>
+      <w:spacing w:after="0" w:before="0" w:line="240" w:lineRule="auto"/>
+      <w:jc w:val="center"/>
+    </w:pPr>
+    <w:rPr>
+      <w:rFonts w:ascii="Times New Roman" w:cs="Times New Roman" w:eastAsia="DFKai-SB" w:hAnsi="Times New Roman"/>
+      <w:b w:val="0"/>
+      <w:i w:val="0"/>
+      <w:color w:val="000000"/>
+      <w:sz w:val="36"/>
+    </w:rPr>
+  </w:style>
+  <w:style w:customStyle="1" w:styleId="CoverDegree" w:type="paragraph">
+    <w:name w:val="Cover Degree"/>
+    <w:basedOn w:val="Normal"/>
+    <w:pPr>
+      <w:spacing w:after="0" w:before="880" w:line="240" w:lineRule="auto"/>
+      <w:jc w:val="center"/>
+    </w:pPr>
+    <w:rPr>
+      <w:rFonts w:ascii="Times New Roman" w:cs="Times New Roman" w:eastAsia="DFKai-SB" w:hAnsi="Times New Roman"/>
+      <w:b w:val="0"/>
+      <w:i w:val="0"/>
+      <w:color w:val="000000"/>
+      <w:sz w:val="48"/>
+    </w:rPr>
+  </w:style>
+  <w:style w:customStyle="1" w:styleId="CoverTitle" w:type="paragraph">
+    <w:name w:val="Cover Title"/>
+    <w:basedOn w:val="Normal"/>
+    <w:pPr>
+      <w:spacing w:after="0" w:before="800" w:line="312" w:lineRule="auto"/>
+      <w:jc w:val="center"/>
+    </w:pPr>
+    <w:rPr>
+      <w:rFonts w:ascii="Times New Roman" w:cs="Times New Roman" w:eastAsia="DFKai-SB" w:hAnsi="Times New Roman"/>
+      <w:b w:val="0"/>
+      <w:i w:val="0"/>
+      <w:color w:val="000000"/>
+      <w:sz w:val="28"/>
+    </w:rPr>
+  </w:style>
+  <w:style w:customStyle="1" w:styleId="CoverPerson" w:type="paragraph">
+    <w:name w:val="Cover Person"/>
+    <w:basedOn w:val="Normal"/>
+    <w:pPr>
+      <w:spacing w:after="0" w:before="1200" w:line="312" w:lineRule="auto"/>
+      <w:ind w:left="1701"/>
+      <w:jc w:val="left"/>
+    </w:pPr>
+    <w:rPr>
+      <w:rFonts w:ascii="Times New Roman" w:cs="Times New Roman" w:eastAsia="DFKai-SB" w:hAnsi="Times New Roman"/>
+      <w:b w:val="0"/>
+      <w:i w:val="0"/>
+      <w:color w:val="000000"/>
+      <w:sz w:val="36"/>
+    </w:rPr>
+  </w:style>
+  <w:style w:customStyle="1" w:styleId="CoverPersonNext" w:type="paragraph">
+    <w:name w:val="Cover Person Next"/>
+    <w:basedOn w:val="Normal"/>
+    <w:pPr>
+      <w:spacing w:after="0" w:before="280" w:line="312" w:lineRule="auto"/>
+      <w:ind w:left="1701"/>
+      <w:jc w:val="left"/>
+    </w:pPr>
+    <w:rPr>
+      <w:rFonts w:ascii="Times New Roman" w:cs="Times New Roman" w:eastAsia="DFKai-SB" w:hAnsi="Times New Roman"/>
+      <w:b w:val="0"/>
+      <w:i w:val="0"/>
+      <w:color w:val="000000"/>
+      <w:sz w:val="36"/>
+    </w:rPr>
+  </w:style>
+  <w:style w:customStyle="1" w:styleId="CoverDate" w:type="paragraph">
+    <w:name w:val="Cover Date"/>
+    <w:basedOn w:val="Normal"/>
+    <w:pPr>
+      <w:spacing w:after="0" w:before="1400" w:line="312" w:lineRule="auto"/>
+      <w:jc w:val="center"/>
+    </w:pPr>
+    <w:rPr>
+      <w:rFonts w:ascii="Times New Roman" w:cs="Times New Roman" w:eastAsia="DFKai-SB" w:hAnsi="Times New Roman"/>
+      <w:b w:val="0"/>
+      <w:i w:val="0"/>
+      <w:color w:val="000000"/>
+      <w:sz w:val="28"/>
+    </w:rPr>
+  </w:style>
+  <w:style w:customStyle="1" w:styleId="TPTitle" w:type="paragraph">
+    <w:name w:val="TP Title"/>
+    <w:basedOn w:val="Normal"/>
+    <w:pPr>
+      <w:spacing w:after="0" w:before="600" w:line="312" w:lineRule="auto"/>
+      <w:jc w:val="center"/>
+    </w:pPr>
+    <w:rPr>
+      <w:rFonts w:ascii="Times New Roman" w:cs="Times New Roman" w:eastAsia="DFKai-SB" w:hAnsi="Times New Roman"/>
+      <w:b/>
+      <w:i w:val="0"/>
+      <w:color w:val="000000"/>
+      <w:sz w:val="28"/>
+    </w:rPr>
+  </w:style>
+  <w:style w:customStyle="1" w:styleId="TPLine" w:type="paragraph">
+    <w:name w:val="TP Line"/>
+    <w:basedOn w:val="Normal"/>
+    <w:pPr>
+      <w:spacing w:after="0" w:before="0" w:line="324" w:lineRule="auto"/>
+      <w:jc w:val="center"/>
+    </w:pPr>
+    <w:rPr>
+      <w:rFonts w:ascii="Times New Roman" w:cs="Times New Roman" w:eastAsia="DFKai-SB" w:hAnsi="Times New Roman"/>
+      <w:b w:val="0"/>
+      <w:i w:val="0"/>
+      <w:color w:val="000000"/>
+      <w:sz w:val="24"/>
+    </w:rPr>
+  </w:style>
+  <w:style w:customStyle="1" w:styleId="TPPeople" w:type="paragraph">
+    <w:name w:val="TP People"/>
+    <w:basedOn w:val="Normal"/>
+    <w:pPr>
+      <w:spacing w:after="0" w:before="480" w:line="360" w:lineRule="auto"/>
+      <w:jc w:val="center"/>
+    </w:pPr>
+    <w:rPr>
+      <w:rFonts w:ascii="Times New Roman" w:cs="Times New Roman" w:eastAsia="DFKai-SB" w:hAnsi="Times New Roman"/>
+      <w:b w:val="0"/>
+      <w:i w:val="0"/>
+      <w:color w:val="000000"/>
+      <w:sz w:val="24"/>
+    </w:rPr>
+  </w:style>
+  <w:style w:customStyle="1" w:styleId="TPBlock" w:type="paragraph">
+    <w:name w:val="TP Block"/>
+    <w:basedOn w:val="Normal"/>
+    <w:pPr>
+      <w:spacing w:after="0" w:before="0" w:line="360" w:lineRule="auto"/>
+      <w:jc w:val="center"/>
+    </w:pPr>
+    <w:rPr>
+      <w:rFonts w:ascii="Times New Roman" w:cs="Times New Roman" w:eastAsia="DFKai-SB" w:hAnsi="Times New Roman"/>
+      <w:b w:val="0"/>
+      <w:i w:val="0"/>
+      <w:color w:val="000000"/>
+      <w:sz w:val="24"/>
+    </w:rPr>
+  </w:style>
+  <w:style w:customStyle="1" w:styleId="TPGap" w:type="paragraph">
+    <w:name w:val="TP Gap"/>
+    <w:basedOn w:val="Normal"/>
+    <w:pPr>
+      <w:spacing w:after="0" w:before="720" w:line="360" w:lineRule="auto"/>
+      <w:jc w:val="center"/>
+    </w:pPr>
+    <w:rPr>
+      <w:rFonts w:ascii="Times New Roman" w:cs="Times New Roman" w:eastAsia="DFKai-SB" w:hAnsi="Times New Roman"/>
+      <w:b w:val="0"/>
+      <w:i w:val="0"/>
+      <w:color w:val="000000"/>
+      <w:sz w:val="24"/>
+    </w:rPr>
+  </w:style>
+  <w:style w:customStyle="1" w:styleId="AbstractHead" w:type="paragraph">
+    <w:name w:val="Abstract Head"/>
+    <w:basedOn w:val="Normal"/>
+    <w:pPr>
+      <w:spacing w:after="0" w:before="0" w:line="360" w:lineRule="auto"/>
+      <w:jc w:val="center"/>
+    </w:pPr>
+    <w:rPr>
+      <w:rFonts w:ascii="Times New Roman" w:cs="Times New Roman" w:eastAsia="DFKai-SB" w:hAnsi="Times New Roman"/>
+      <w:b w:val="0"/>
+      <w:i w:val="0"/>
+      <w:color w:val="000000"/>
+      <w:sz w:val="24"/>
+    </w:rPr>
+  </w:style>
+  <w:style w:customStyle="1" w:styleId="AbstractLabel" w:type="paragraph">
+    <w:name w:val="Abstract Label"/>
+    <w:basedOn w:val="Normal"/>
+    <w:pPr>
+      <w:spacing w:after="280" w:before="360" w:line="312" w:lineRule="auto"/>
+      <w:jc w:val="center"/>
+    </w:pPr>
+    <w:rPr>
+      <w:rFonts w:ascii="Times New Roman" w:cs="Times New Roman" w:eastAsia="DFKai-SB" w:hAnsi="Times New Roman"/>
+      <w:b/>
+      <w:i w:val="0"/>
+      <w:color w:val="000000"/>
+      <w:sz w:val="24"/>
     </w:rPr>
   </w:style>
   <w:style w:customStyle="1" w:styleId="Equation" w:type="paragraph">

</xml_diff>

<commit_message>
YZU file: cover and title page at the templates' margins and sizes
The first version put the 4 cm binding margin and 12 pt type on the cover
and title page, so they sat off-centre and small. They now use the official
templates' margins and sizes, in sections of their own. 84 pages; numbers
and margins re-verified. Log row added.

Co-Authored-By: Claude Sonnet 5.5 <noreply@anthropic.com>
Claude-Session: https://claude.ai/code/session_01XxH9J9TaLYfAYFCaGAqS9y
</commit_message>
<xml_diff>
--- a/papers/thesis_2026-10/reading/thesis_YZU_layout_2026-10-24.docx
+++ b/papers/thesis_2026-10/reading/thesis_YZU_layout_2026-10-24.docx
@@ -7,7 +7,7 @@
         <w:pStyle w:val="CoverUniversity"/>
       </w:pPr>
       <w:r>
-        <w:t xml:space="preserve">元智大學</w:t>
+        <w:t xml:space="preserve">元　智　大　學</w:t>
       </w:r>
     </w:p>
     <w:p>
@@ -31,7 +31,7 @@
         <w:pStyle w:val="CoverDegree"/>
       </w:pPr>
       <w:r>
-        <w:t xml:space="preserve">碩士論文</w:t>
+        <w:t xml:space="preserve">碩　士　論　文</w:t>
       </w:r>
     </w:p>
     <w:p>
@@ -70,7 +70,7 @@
       <w:pPr>
         <w:sectPr>
           <w:pgSz w:h="16838" w:w="11906"/>
-          <w:pgMar w:bottom="1134" w:footer="567" w:header="850" w:left="2268" w:right="1134" w:top="1984"/>
+          <w:pgMar w:bottom="1440" w:footer="0" w:header="850" w:left="1797" w:right="1797" w:top="1440"/>
         </w:sectPr>
       </w:pPr>
     </w:p>
@@ -225,6 +225,14 @@
       <w:r>
         <w:t xml:space="preserve">中華民國 115 年 10 月</w:t>
       </w:r>
+    </w:p>
+    <w:p>
+      <w:pPr>
+        <w:sectPr>
+          <w:pgSz w:h="16838" w:w="11906"/>
+          <w:pgMar w:bottom="1440" w:footer="0" w:header="850" w:left="1797" w:right="1797" w:top="1440"/>
+        </w:sectPr>
+      </w:pPr>
     </w:p>
     <w:p>
       <w:pPr>
@@ -3063,11 +3071,9 @@
       <w:pPr>
         <w:sectPr>
           <w:footerReference r:id="rId9" w:type="default"/>
-          <w:footerReference w:type="first" r:id="rId10"/>
           <w:pgSz w:h="16838" w:w="11906"/>
           <w:pgMar w:bottom="1134" w:footer="567" w:header="850" w:left="2268" w:right="1134" w:top="1984"/>
-          <w:pgNumType w:fmt="lowerRoman" w:start="1"/>
-          <w:titlePg/>
+          <w:pgNumType w:fmt="lowerRoman" w:start="2"/>
         </w:sectPr>
       </w:pPr>
     </w:p>
@@ -30378,16 +30384,6 @@
       <w:t>1</w:t>
       <w:fldChar w:fldCharType="end"/>
     </w:r>
-  </w:p>
-</w:ftr>
-</file>
-
-<file path=word/footer2.xml><?xml version="1.0" encoding="utf-8"?>
-<w:ftr xmlns:m="http://schemas.openxmlformats.org/officeDocument/2006/math" xmlns:mc="http://schemas.openxmlformats.org/markup-compatibility/2006" xmlns:mo="http://schemas.microsoft.com/office/mac/office/2008/main" xmlns:mv="urn:schemas-microsoft-com:mac:vml" xmlns:o="urn:schemas-microsoft-com:office:office" xmlns:r="http://schemas.openxmlformats.org/officeDocument/2006/relationships" xmlns:v="urn:schemas-microsoft-com:vml" xmlns:w10="urn:schemas-microsoft-com:office:word" xmlns:w14="http://schemas.microsoft.com/office/word/2010/wordml" xmlns:w="http://schemas.openxmlformats.org/wordprocessingml/2006/main" xmlns:wne="http://schemas.microsoft.com/office/word/2006/wordml" xmlns:wp14="http://schemas.microsoft.com/office/word/2010/wordprocessingDrawing" xmlns:wp="http://schemas.openxmlformats.org/drawingml/2006/wordprocessingDrawing" xmlns:wpc="http://schemas.microsoft.com/office/word/2010/wordprocessingCanvas" xmlns:wpg="http://schemas.microsoft.com/office/word/2010/wordprocessingGroup" xmlns:wpi="http://schemas.microsoft.com/office/word/2010/wordprocessingInk" xmlns:wps="http://schemas.microsoft.com/office/word/2010/wordprocessingShape" mc:Ignorable="w14 wp14">
-  <w:p>
-    <w:pPr>
-      <w:pStyle w:val="Footer"/>
-    </w:pPr>
   </w:p>
 </w:ftr>
 </file>
@@ -31378,7 +31374,22 @@
     <w:name w:val="Cover Date"/>
     <w:basedOn w:val="Normal"/>
     <w:pPr>
-      <w:spacing w:after="0" w:before="1400" w:line="312" w:lineRule="auto"/>
+      <w:spacing w:after="0" w:before="1200" w:line="312" w:lineRule="auto"/>
+      <w:jc w:val="center"/>
+    </w:pPr>
+    <w:rPr>
+      <w:rFonts w:ascii="Times New Roman" w:cs="Times New Roman" w:eastAsia="DFKai-SB" w:hAnsi="Times New Roman"/>
+      <w:b w:val="0"/>
+      <w:i w:val="0"/>
+      <w:color w:val="000000"/>
+      <w:sz w:val="36"/>
+    </w:rPr>
+  </w:style>
+  <w:style w:customStyle="1" w:styleId="TPTitle" w:type="paragraph">
+    <w:name w:val="TP Title"/>
+    <w:basedOn w:val="Normal"/>
+    <w:pPr>
+      <w:spacing w:after="0" w:before="200" w:line="312" w:lineRule="auto"/>
       <w:jc w:val="center"/>
     </w:pPr>
     <w:rPr>
@@ -31389,26 +31400,11 @@
       <w:sz w:val="28"/>
     </w:rPr>
   </w:style>
-  <w:style w:customStyle="1" w:styleId="TPTitle" w:type="paragraph">
-    <w:name w:val="TP Title"/>
-    <w:basedOn w:val="Normal"/>
-    <w:pPr>
-      <w:spacing w:after="0" w:before="600" w:line="312" w:lineRule="auto"/>
-      <w:jc w:val="center"/>
-    </w:pPr>
-    <w:rPr>
-      <w:rFonts w:ascii="Times New Roman" w:cs="Times New Roman" w:eastAsia="DFKai-SB" w:hAnsi="Times New Roman"/>
-      <w:b/>
-      <w:i w:val="0"/>
-      <w:color w:val="000000"/>
-      <w:sz w:val="28"/>
-    </w:rPr>
-  </w:style>
   <w:style w:customStyle="1" w:styleId="TPLine" w:type="paragraph">
     <w:name w:val="TP Line"/>
     <w:basedOn w:val="Normal"/>
     <w:pPr>
-      <w:spacing w:after="0" w:before="0" w:line="324" w:lineRule="auto"/>
+      <w:spacing w:after="0" w:before="0" w:line="336" w:lineRule="auto"/>
       <w:jc w:val="center"/>
     </w:pPr>
     <w:rPr>
@@ -31416,14 +31412,14 @@
       <w:b w:val="0"/>
       <w:i w:val="0"/>
       <w:color w:val="000000"/>
-      <w:sz w:val="24"/>
+      <w:sz w:val="28"/>
     </w:rPr>
   </w:style>
   <w:style w:customStyle="1" w:styleId="TPPeople" w:type="paragraph">
     <w:name w:val="TP People"/>
     <w:basedOn w:val="Normal"/>
     <w:pPr>
-      <w:spacing w:after="0" w:before="480" w:line="360" w:lineRule="auto"/>
+      <w:spacing w:after="0" w:before="280" w:line="336" w:lineRule="auto"/>
       <w:jc w:val="center"/>
     </w:pPr>
     <w:rPr>
@@ -31431,14 +31427,14 @@
       <w:b w:val="0"/>
       <w:i w:val="0"/>
       <w:color w:val="000000"/>
-      <w:sz w:val="24"/>
+      <w:sz w:val="28"/>
     </w:rPr>
   </w:style>
   <w:style w:customStyle="1" w:styleId="TPBlock" w:type="paragraph">
     <w:name w:val="TP Block"/>
     <w:basedOn w:val="Normal"/>
     <w:pPr>
-      <w:spacing w:after="0" w:before="0" w:line="360" w:lineRule="auto"/>
+      <w:spacing w:after="0" w:before="0" w:line="336" w:lineRule="auto"/>
       <w:jc w:val="center"/>
     </w:pPr>
     <w:rPr>
@@ -31446,14 +31442,14 @@
       <w:b w:val="0"/>
       <w:i w:val="0"/>
       <w:color w:val="000000"/>
-      <w:sz w:val="24"/>
+      <w:sz w:val="28"/>
     </w:rPr>
   </w:style>
   <w:style w:customStyle="1" w:styleId="TPGap" w:type="paragraph">
     <w:name w:val="TP Gap"/>
     <w:basedOn w:val="Normal"/>
     <w:pPr>
-      <w:spacing w:after="0" w:before="720" w:line="360" w:lineRule="auto"/>
+      <w:spacing w:after="0" w:before="400" w:line="336" w:lineRule="auto"/>
       <w:jc w:val="center"/>
     </w:pPr>
     <w:rPr>
@@ -31461,7 +31457,7 @@
       <w:b w:val="0"/>
       <w:i w:val="0"/>
       <w:color w:val="000000"/>
-      <w:sz w:val="24"/>
+      <w:sz w:val="28"/>
     </w:rPr>
   </w:style>
   <w:style w:customStyle="1" w:styleId="AbstractHead" w:type="paragraph">

</xml_diff>